<commit_message>
Rewrite report explanations in simpler language and add key terms section
</commit_message>
<xml_diff>
--- a/CSIT128_A1_Report_Parts1-3.docx
+++ b/CSIT128_A1_Report_Parts1-3.docx
@@ -12,7 +12,194 @@
     </w:p>
     <w:p>
       <w:r>
-        <w:t xml:space="preserve">This section explains the HTML code for Parts 1, 2 and 3 of our web page. Each part shows a screenshot of the code (with the real line numbers from our file), followed by an explanation of what each piece of code does and why we used it.</w:t>
+        <w:t xml:space="preserve">This report explains the HTML code for Parts 1, 2 and 3 of our web page. For each part, there is a screenshot of the code (with the real line numbers from our file), followed by a simple explanation of what each piece of code does and why we used it.</w:t>
+      </w:r>
+    </w:p>
+    <w:p>
+      <w:pPr>
+        <w:pStyle w:val="Heading2"/>
+      </w:pPr>
+      <w:r>
+        <w:t xml:space="preserve">A few key words first</w:t>
+      </w:r>
+    </w:p>
+    <w:p>
+      <w:r>
+        <w:t xml:space="preserve">These words come up a lot in the explanations below:</w:t>
+      </w:r>
+    </w:p>
+    <w:p>
+      <w:pPr>
+        <w:numPr>
+          <w:ilvl w:val="0"/>
+          <w:numId w:val="1"/>
+        </w:numPr>
+      </w:pPr>
+      <w:r>
+        <w:rPr>
+          <w:b/>
+        </w:rPr>
+        <w:t xml:space="preserve">Tag:</w:t>
+      </w:r>
+      <w:r>
+        <w:t xml:space="preserve"> an instruction written inside angle brackets, like </w:t>
+      </w:r>
+      <w:r>
+        <w:rPr>
+          <w:rFonts w:ascii="Consolas" w:hAnsi="Consolas" w:cs="Consolas"/>
+          <w:sz w:val="19"/>
+          <w:szCs w:val="19"/>
+          <w:shd w:val="clear" w:color="auto" w:fill="F2F2F2"/>
+        </w:rPr>
+        <w:t xml:space="preserve">&lt;p&gt;</w:t>
+      </w:r>
+      <w:r>
+        <w:t xml:space="preserve">. Tags tell the browser what each part of the page is (a heading, a paragraph, a picture, and so on).</w:t>
+      </w:r>
+    </w:p>
+    <w:p>
+      <w:pPr>
+        <w:numPr>
+          <w:ilvl w:val="0"/>
+          <w:numId w:val="1"/>
+        </w:numPr>
+      </w:pPr>
+      <w:r>
+        <w:rPr>
+          <w:b/>
+        </w:rPr>
+        <w:t xml:space="preserve">Opening and closing tags:</w:t>
+      </w:r>
+      <w:r>
+        <w:t xml:space="preserve"> most tags come in pairs. </w:t>
+      </w:r>
+      <w:r>
+        <w:rPr>
+          <w:rFonts w:ascii="Consolas" w:hAnsi="Consolas" w:cs="Consolas"/>
+          <w:sz w:val="19"/>
+          <w:szCs w:val="19"/>
+          <w:shd w:val="clear" w:color="auto" w:fill="F2F2F2"/>
+        </w:rPr>
+        <w:t xml:space="preserve">&lt;p&gt;</w:t>
+      </w:r>
+      <w:r>
+        <w:t xml:space="preserve"> starts a paragraph and </w:t>
+      </w:r>
+      <w:r>
+        <w:rPr>
+          <w:rFonts w:ascii="Consolas" w:hAnsi="Consolas" w:cs="Consolas"/>
+          <w:sz w:val="19"/>
+          <w:szCs w:val="19"/>
+          <w:shd w:val="clear" w:color="auto" w:fill="F2F2F2"/>
+        </w:rPr>
+        <w:t xml:space="preserve">&lt;/p&gt;</w:t>
+      </w:r>
+      <w:r>
+        <w:t xml:space="preserve"> (with a slash) ends it. Whatever is in between belongs to that tag.</w:t>
+      </w:r>
+    </w:p>
+    <w:p>
+      <w:pPr>
+        <w:numPr>
+          <w:ilvl w:val="0"/>
+          <w:numId w:val="1"/>
+        </w:numPr>
+      </w:pPr>
+      <w:r>
+        <w:rPr>
+          <w:b/>
+        </w:rPr>
+        <w:t xml:space="preserve">Element:</w:t>
+      </w:r>
+      <w:r>
+        <w:t xml:space="preserve"> the opening tag, the closing tag, and everything in between, counted as one item.</w:t>
+      </w:r>
+    </w:p>
+    <w:p>
+      <w:pPr>
+        <w:numPr>
+          <w:ilvl w:val="0"/>
+          <w:numId w:val="1"/>
+        </w:numPr>
+      </w:pPr>
+      <w:r>
+        <w:rPr>
+          <w:b/>
+        </w:rPr>
+        <w:t xml:space="preserve">Attribute:</w:t>
+      </w:r>
+      <w:r>
+        <w:t xml:space="preserve"> an extra setting added inside an opening tag, like </w:t>
+      </w:r>
+      <w:r>
+        <w:rPr>
+          <w:rFonts w:ascii="Consolas" w:hAnsi="Consolas" w:cs="Consolas"/>
+          <w:sz w:val="19"/>
+          <w:szCs w:val="19"/>
+          <w:shd w:val="clear" w:color="auto" w:fill="F2F2F2"/>
+        </w:rPr>
+        <w:t xml:space="preserve">width="80%"</w:t>
+      </w:r>
+      <w:r>
+        <w:t xml:space="preserve">. It changes how that element looks or behaves.</w:t>
+      </w:r>
+    </w:p>
+    <w:p>
+      <w:pPr>
+        <w:numPr>
+          <w:ilvl w:val="0"/>
+          <w:numId w:val="1"/>
+        </w:numPr>
+      </w:pPr>
+      <w:r>
+        <w:rPr>
+          <w:b/>
+        </w:rPr>
+        <w:t xml:space="preserve">Style:</w:t>
+      </w:r>
+      <w:r>
+        <w:t xml:space="preserve"> the </w:t>
+      </w:r>
+      <w:r>
+        <w:rPr>
+          <w:rFonts w:ascii="Consolas" w:hAnsi="Consolas" w:cs="Consolas"/>
+          <w:sz w:val="19"/>
+          <w:szCs w:val="19"/>
+          <w:shd w:val="clear" w:color="auto" w:fill="F2F2F2"/>
+        </w:rPr>
+        <w:t xml:space="preserve">style="…"</w:t>
+      </w:r>
+      <w:r>
+        <w:t xml:space="preserve"> attribute lets us change the look of one element directly, such as its colour, size or spacing.</w:t>
+      </w:r>
+    </w:p>
+    <w:p>
+      <w:pPr>
+        <w:numPr>
+          <w:ilvl w:val="0"/>
+          <w:numId w:val="1"/>
+        </w:numPr>
+      </w:pPr>
+      <w:r>
+        <w:rPr>
+          <w:b/>
+        </w:rPr>
+        <w:t xml:space="preserve">Pixel (px):</w:t>
+      </w:r>
+      <w:r>
+        <w:t xml:space="preserve"> one tiny dot on the screen. We use pixels to measure sizes and spaces, such as </w:t>
+      </w:r>
+      <w:r>
+        <w:rPr>
+          <w:rFonts w:ascii="Consolas" w:hAnsi="Consolas" w:cs="Consolas"/>
+          <w:sz w:val="19"/>
+          <w:szCs w:val="19"/>
+          <w:shd w:val="clear" w:color="auto" w:fill="F2F2F2"/>
+        </w:rPr>
+        <w:t xml:space="preserve">20px</w:t>
+      </w:r>
+      <w:r>
+        <w:t xml:space="preserve">.</w:t>
       </w:r>
     </w:p>
     <w:p>
@@ -25,7 +212,7 @@
     </w:p>
     <w:p>
       <w:r>
-        <w:t xml:space="preserve">In Part 1 we made a table showing our group name, plus each member's student number, name and email. This is what it looks like in the browser:</w:t>
+        <w:t xml:space="preserve">In Part 1 we made a table that shows our group name and each member's student number, name and email. This is what it looks like when the page is opened in a browser:</w:t>
       </w:r>
     </w:p>
     <w:p>
@@ -152,7 +339,7 @@
     </w:p>
     <w:p>
       <w:r>
-        <w:t xml:space="preserve">Every HTML page starts with the same basic setup. This code isn't shown on the page itself. It gives the browser information about the page.</w:t>
+        <w:t xml:space="preserve">Every HTML page starts with the same basic setup. You can think of it like the cover and information page of a book: it doesn't appear on the page itself, but it tells the browser important things about the page before it starts showing anything.</w:t>
       </w:r>
     </w:p>
     <w:tbl>
@@ -214,7 +401,7 @@
               <w:rPr>
                 <w:b/>
               </w:rPr>
-              <w:t xml:space="preserve">What it does</w:t>
+              <w:t xml:space="preserve">What it means</w:t>
             </w:r>
           </w:p>
         </w:tc>
@@ -252,7 +439,7 @@
               <w:spacing w:before="0" w:after="0"/>
             </w:pPr>
             <w:r>
-              <w:t xml:space="preserve">Tells the browser this is an HTML5 document, so it displays the page using modern HTML rules.</w:t>
+              <w:t xml:space="preserve">The very first line. It tells the browser "this is a modern HTML page", so the browser knows which rules to follow when showing it.</w:t>
             </w:r>
           </w:p>
         </w:tc>
@@ -290,7 +477,16 @@
               <w:spacing w:before="0" w:after="0"/>
             </w:pPr>
             <w:r>
-              <w:t xml:space="preserve">The root element. Everything else on the page goes inside it. </w:t>
+              <w:t xml:space="preserve">This tag wraps around the </w:t>
+            </w:r>
+            <w:r>
+              <w:rPr>
+                <w:b/>
+              </w:rPr>
+              <w:t xml:space="preserve">whole</w:t>
+            </w:r>
+            <w:r>
+              <w:t xml:space="preserve"> page. Everything else goes inside it. </w:t>
             </w:r>
             <w:r>
               <w:rPr>
@@ -302,7 +498,7 @@
               <w:t xml:space="preserve">lang="en"</w:t>
             </w:r>
             <w:r>
-              <w:t xml:space="preserve"> tells the browser (and screen readers / search engines) that the page is in English.</w:t>
+              <w:t xml:space="preserve"> says the page is written in English, which helps screen readers (tools that read pages out loud) and search engines.</w:t>
             </w:r>
           </w:p>
         </w:tc>
@@ -340,7 +536,7 @@
               <w:spacing w:before="0" w:after="0"/>
             </w:pPr>
             <w:r>
-              <w:t xml:space="preserve">Holds information </w:t>
+              <w:t xml:space="preserve">The "behind the scenes" section. It holds information </w:t>
             </w:r>
             <w:r>
               <w:rPr>
@@ -349,7 +545,7 @@
               <w:t xml:space="preserve">about</w:t>
             </w:r>
             <w:r>
-              <w:t xml:space="preserve"> the page, such as the title and character set. Nothing in here appears in the page content.</w:t>
+              <w:t xml:space="preserve"> the page, such as its title. Nothing in here shows up on the page itself.</w:t>
             </w:r>
           </w:p>
         </w:tc>
@@ -387,7 +583,7 @@
               <w:spacing w:before="0" w:after="0"/>
             </w:pPr>
             <w:r>
-              <w:t xml:space="preserve">Sets the character encoding to UTF-8 so letters, numbers and symbols display correctly.</w:t>
+              <w:t xml:space="preserve">Tells the browser which set of characters to use. UTF-8 covers almost every letter and symbol, so all our text shows up properly instead of turning into strange symbols.</w:t>
             </w:r>
           </w:p>
         </w:tc>
@@ -425,7 +621,7 @@
               <w:spacing w:before="0" w:after="0"/>
             </w:pPr>
             <w:r>
-              <w:t xml:space="preserve">Makes the page fit the width of the device screen (</w:t>
+              <w:t xml:space="preserve">Makes the page fit properly on any screen size, including phones. </w:t>
             </w:r>
             <w:r>
               <w:rPr>
@@ -437,7 +633,7 @@
               <w:t xml:space="preserve">width=device-width</w:t>
             </w:r>
             <w:r>
-              <w:t xml:space="preserve">) and start at normal zoom (</w:t>
+              <w:t xml:space="preserve"> means "make the page as wide as the screen", and </w:t>
             </w:r>
             <w:r>
               <w:rPr>
@@ -449,7 +645,7 @@
               <w:t xml:space="preserve">initial-scale=1.0</w:t>
             </w:r>
             <w:r>
-              <w:t xml:space="preserve">), so the page also looks right on phones.</w:t>
+              <w:t xml:space="preserve"> means "start at normal zoom".</w:t>
             </w:r>
           </w:p>
         </w:tc>
@@ -487,7 +683,16 @@
               <w:spacing w:before="0" w:after="0"/>
             </w:pPr>
             <w:r>
-              <w:t xml:space="preserve">The text shown on the browser tab. We used our group code, student numbers and names as required.</w:t>
+              <w:t xml:space="preserve">The text shown on the browser </w:t>
+            </w:r>
+            <w:r>
+              <w:rPr>
+                <w:b/>
+              </w:rPr>
+              <w:t xml:space="preserve">tab</w:t>
+            </w:r>
+            <w:r>
+              <w:t xml:space="preserve"> at the top of the window. As the assignment asked, we put our group code, student numbers and names here.</w:t>
             </w:r>
           </w:p>
         </w:tc>
@@ -525,7 +730,7 @@
               <w:spacing w:before="0" w:after="0"/>
             </w:pPr>
             <w:r>
-              <w:t xml:space="preserve">Everything that is visible on the page goes inside the body.</w:t>
+              <w:t xml:space="preserve">The start of the visible page. Everything the user actually sees (headings, tables, pictures, text) goes inside the body.</w:t>
             </w:r>
           </w:p>
         </w:tc>
@@ -541,7 +746,7 @@
         <w:pStyle w:val="Heading2"/>
       </w:pPr>
       <w:r>
-        <w:t xml:space="preserve">1.2 Heading and table setup (lines 11–13)</w:t>
+        <w:t xml:space="preserve">1.2 The heading and the start of the table (lines 11–13)</w:t>
       </w:r>
     </w:p>
     <w:p>
@@ -660,7 +865,7 @@
               <w:rPr>
                 <w:b/>
               </w:rPr>
-              <w:t xml:space="preserve">What it does</w:t>
+              <w:t xml:space="preserve">What it means</w:t>
             </w:r>
           </w:p>
         </w:tc>
@@ -698,7 +903,43 @@
               <w:spacing w:before="0" w:after="0"/>
             </w:pPr>
             <w:r>
-              <w:t xml:space="preserve">The biggest heading on the page. We use it for the title of each Part.</w:t>
+              <w:t xml:space="preserve">A heading. The "1" means it's the biggest and most important heading size (sizes go from </w:t>
+            </w:r>
+            <w:r>
+              <w:rPr>
+                <w:rFonts w:ascii="Consolas" w:hAnsi="Consolas" w:cs="Consolas"/>
+                <w:sz w:val="19"/>
+                <w:szCs w:val="19"/>
+                <w:shd w:val="clear" w:color="auto" w:fill="F2F2F2"/>
+              </w:rPr>
+              <w:t xml:space="preserve">&lt;h1&gt;</w:t>
+            </w:r>
+            <w:r>
+              <w:t xml:space="preserve"> down to </w:t>
+            </w:r>
+            <w:r>
+              <w:rPr>
+                <w:rFonts w:ascii="Consolas" w:hAnsi="Consolas" w:cs="Consolas"/>
+                <w:sz w:val="19"/>
+                <w:szCs w:val="19"/>
+                <w:shd w:val="clear" w:color="auto" w:fill="F2F2F2"/>
+              </w:rPr>
+              <w:t xml:space="preserve">&lt;h6&gt;</w:t>
+            </w:r>
+            <w:r>
+              <w:t xml:space="preserve">). We use </w:t>
+            </w:r>
+            <w:r>
+              <w:rPr>
+                <w:rFonts w:ascii="Consolas" w:hAnsi="Consolas" w:cs="Consolas"/>
+                <w:sz w:val="19"/>
+                <w:szCs w:val="19"/>
+                <w:shd w:val="clear" w:color="auto" w:fill="F2F2F2"/>
+              </w:rPr>
+              <w:t xml:space="preserve">&lt;h1&gt;</w:t>
+            </w:r>
+            <w:r>
+              <w:t xml:space="preserve"> for the title of each Part.</w:t>
             </w:r>
           </w:p>
         </w:tc>
@@ -736,7 +977,7 @@
               <w:spacing w:before="0" w:after="0"/>
             </w:pPr>
             <w:r>
-              <w:t xml:space="preserve">Horizontal rule. Draws a line across the page to separate sections. It has no closing tag.</w:t>
+              <w:t xml:space="preserve">Draws a straight horizontal line across the page to separate sections. It has no closing tag because there is nothing to put inside it.</w:t>
             </w:r>
           </w:p>
         </w:tc>
@@ -774,7 +1015,19 @@
               <w:spacing w:before="0" w:after="0"/>
             </w:pPr>
             <w:r>
-              <w:t xml:space="preserve">Starts the table.</w:t>
+              <w:t xml:space="preserve">Starts the table. Everything up to </w:t>
+            </w:r>
+            <w:r>
+              <w:rPr>
+                <w:rFonts w:ascii="Consolas" w:hAnsi="Consolas" w:cs="Consolas"/>
+                <w:sz w:val="19"/>
+                <w:szCs w:val="19"/>
+                <w:shd w:val="clear" w:color="auto" w:fill="F2F2F2"/>
+              </w:rPr>
+              <w:t xml:space="preserve">&lt;/table&gt;</w:t>
+            </w:r>
+            <w:r>
+              <w:t xml:space="preserve"> is part of it.</w:t>
             </w:r>
           </w:p>
         </w:tc>
@@ -812,16 +1065,7 @@
               <w:spacing w:before="0" w:after="0"/>
             </w:pPr>
             <w:r>
-              <w:t xml:space="preserve">Draws a 1-pixel border around the whole table </w:t>
-            </w:r>
-            <w:r>
-              <w:rPr>
-                <w:b/>
-              </w:rPr>
-              <w:t xml:space="preserve">and</w:t>
-            </w:r>
-            <w:r>
-              <w:t xml:space="preserve"> around every cell.</w:t>
+              <w:t xml:space="preserve">Draws lines around the table and around every box (cell) in it. The "1" means the lines are 1 pixel thick. Without this, the table would have no visible lines at all.</w:t>
             </w:r>
           </w:p>
         </w:tc>
@@ -859,7 +1103,7 @@
               <w:spacing w:before="0" w:after="0"/>
             </w:pPr>
             <w:r>
-              <w:t xml:space="preserve">Makes the border lines black.</w:t>
+              <w:t xml:space="preserve">Makes those lines black.</w:t>
             </w:r>
           </w:p>
         </w:tc>
@@ -897,7 +1141,7 @@
               <w:spacing w:before="0" w:after="0"/>
             </w:pPr>
             <w:r>
-              <w:t xml:space="preserve">The table takes up 80% of the page width, so it grows and shrinks with the browser window.</w:t>
+              <w:t xml:space="preserve">Makes the table 80% as wide as the page. Because it's a percentage, the table gets wider or narrower when the browser window is resized.</w:t>
             </w:r>
           </w:p>
         </w:tc>
@@ -935,7 +1179,7 @@
               <w:spacing w:before="0" w:after="0"/>
             </w:pPr>
             <w:r>
-              <w:t xml:space="preserve">Adds 8 pixels of space between the text and the cell border, so the text isn't squashed against the lines.</w:t>
+              <w:t xml:space="preserve">Adds 8 pixels of empty space inside each box, between the text and the box's border. It works like the margin on a sheet of paper, so the text isn't squashed against the lines.</w:t>
             </w:r>
           </w:p>
         </w:tc>
@@ -962,7 +1206,7 @@
         <w:t xml:space="preserve">How a table is built:</w:t>
       </w:r>
       <w:r>
-        <w:t xml:space="preserve"> a table is made row by row. </w:t>
+        <w:t xml:space="preserve"> a table is built one row at a time, from top to bottom. </w:t>
       </w:r>
       <w:r>
         <w:rPr>
@@ -974,7 +1218,7 @@
         <w:t xml:space="preserve">&lt;tr&gt;</w:t>
       </w:r>
       <w:r>
-        <w:t xml:space="preserve"> means "table row". Inside each row, </w:t>
+        <w:t xml:space="preserve"> ("table row") starts a new row. Inside each row, we add the boxes from left to right: </w:t>
       </w:r>
       <w:r>
         <w:rPr>
@@ -986,7 +1230,7 @@
         <w:t xml:space="preserve">&lt;th&gt;</w:t>
       </w:r>
       <w:r>
-        <w:t xml:space="preserve"> is a header cell (bold and centred by default) and </w:t>
+        <w:t xml:space="preserve"> is a header box (its text is bold and centred automatically) and </w:t>
       </w:r>
       <w:r>
         <w:rPr>
@@ -998,7 +1242,7 @@
         <w:t xml:space="preserve">&lt;td&gt;</w:t>
       </w:r>
       <w:r>
-        <w:t xml:space="preserve"> is a normal data cell.</w:t>
+        <w:t xml:space="preserve"> is a normal box for data.</w:t>
       </w:r>
     </w:p>
     <w:p>
@@ -1125,7 +1369,7 @@
               <w:rPr>
                 <w:b/>
               </w:rPr>
-              <w:t xml:space="preserve">What it does</w:t>
+              <w:t xml:space="preserve">What it means</w:t>
             </w:r>
           </w:p>
         </w:tc>
@@ -1163,43 +1407,8 @@
               <w:spacing w:before="0" w:after="0"/>
             </w:pPr>
             <w:r>
-              <w:t xml:space="preserve">A comment. It's a note to ourselves that the browser ignores, so it never shows on the page.</w:t>
-            </w:r>
-          </w:p>
-        </w:tc>
-      </w:tr>
-      <w:tr>
-        <w:trPr>
-          <w:cantSplit/>
-        </w:trPr>
-        <w:tc>
-          <w:tcPr>
-            <w:tcW w:w="3100" w:type="dxa"/>
-            <w:shd w:val="clear" w:color="auto" w:fill="F7F9FC"/>
-          </w:tcPr>
-          <w:p>
-            <w:pPr>
-              <w:spacing w:before="0" w:after="0"/>
-            </w:pPr>
-            <w:r>
-              <w:rPr>
-                <w:rFonts w:ascii="Consolas" w:hAnsi="Consolas" w:cs="Consolas"/>
-                <w:sz w:val="18"/>
-                <w:szCs w:val="18"/>
-                <w:shd w:val="clear" w:color="auto" w:fill="F2F2F2"/>
-              </w:rPr>
-              <w:t xml:space="preserve">&lt;th colspan="3"&gt;</w:t>
-            </w:r>
-          </w:p>
-        </w:tc>
-        <w:tc>
-          <w:tcPr>
-            <w:tcW w:w="5926" w:type="dxa"/>
-          </w:tcPr>
-          <w:p>
-            <w:pPr>
-              <w:spacing w:before="0" w:after="0"/>
-            </w:pPr>
+              <w:t xml:space="preserve">A comment. Anything between </w:t>
+            </w:r>
             <w:r>
               <w:rPr>
                 <w:rFonts w:ascii="Consolas" w:hAnsi="Consolas" w:cs="Consolas"/>
@@ -1207,95 +1416,10 @@
                 <w:szCs w:val="19"/>
                 <w:shd w:val="clear" w:color="auto" w:fill="F2F2F2"/>
               </w:rPr>
-              <w:t xml:space="preserve">colspan="3"</w:t>
-            </w:r>
-            <w:r>
-              <w:t xml:space="preserve"> makes this header cell stretch across </w:t>
-            </w:r>
-            <w:r>
-              <w:rPr>
-                <w:b/>
-              </w:rPr>
-              <w:t xml:space="preserve">3 columns</w:t>
-            </w:r>
-            <w:r>
-              <w:t xml:space="preserve">. That's why "CSIT128: Assignment 1" is wide and sits above the label, number and name columns.</w:t>
-            </w:r>
-          </w:p>
-        </w:tc>
-      </w:tr>
-      <w:tr>
-        <w:trPr>
-          <w:cantSplit/>
-        </w:trPr>
-        <w:tc>
-          <w:tcPr>
-            <w:tcW w:w="3100" w:type="dxa"/>
-            <w:shd w:val="clear" w:color="auto" w:fill="F7F9FC"/>
-          </w:tcPr>
-          <w:p>
-            <w:pPr>
-              <w:spacing w:before="0" w:after="0"/>
-            </w:pPr>
-            <w:r>
-              <w:rPr>
-                <w:rFonts w:ascii="Consolas" w:hAnsi="Consolas" w:cs="Consolas"/>
-                <w:sz w:val="18"/>
-                <w:szCs w:val="18"/>
-                <w:shd w:val="clear" w:color="auto" w:fill="F2F2F2"/>
-              </w:rPr>
-              <w:t xml:space="preserve">&lt;th&gt;Group n0h4ts&lt;/th&gt;</w:t>
-            </w:r>
-          </w:p>
-        </w:tc>
-        <w:tc>
-          <w:tcPr>
-            <w:tcW w:w="5926" w:type="dxa"/>
-          </w:tcPr>
-          <w:p>
-            <w:pPr>
-              <w:spacing w:before="0" w:after="0"/>
-            </w:pPr>
-            <w:r>
-              <w:t xml:space="preserve">The second header cell fills the 4th column. 3 + 1 = 4 columns in total. Every row has to add up to 4 columns.</w:t>
-            </w:r>
-          </w:p>
-        </w:tc>
-      </w:tr>
-      <w:tr>
-        <w:trPr>
-          <w:cantSplit/>
-        </w:trPr>
-        <w:tc>
-          <w:tcPr>
-            <w:tcW w:w="3100" w:type="dxa"/>
-            <w:shd w:val="clear" w:color="auto" w:fill="F7F9FC"/>
-          </w:tcPr>
-          <w:p>
-            <w:pPr>
-              <w:spacing w:before="0" w:after="0"/>
-            </w:pPr>
-            <w:r>
-              <w:rPr>
-                <w:rFonts w:ascii="Consolas" w:hAnsi="Consolas" w:cs="Consolas"/>
-                <w:sz w:val="18"/>
-                <w:szCs w:val="18"/>
-                <w:shd w:val="clear" w:color="auto" w:fill="F2F2F2"/>
-              </w:rPr>
-              <w:t xml:space="preserve">background-color: #C6D9F1</w:t>
-            </w:r>
-          </w:p>
-        </w:tc>
-        <w:tc>
-          <w:tcPr>
-            <w:tcW w:w="5926" w:type="dxa"/>
-          </w:tcPr>
-          <w:p>
-            <w:pPr>
-              <w:spacing w:before="0" w:after="0"/>
-            </w:pPr>
-            <w:r>
-              <w:t xml:space="preserve">An inline style that gives the cell a light-blue background. </w:t>
+              <w:t xml:space="preserve">&lt;!--</w:t>
+            </w:r>
+            <w:r>
+              <w:t xml:space="preserve"> and </w:t>
             </w:r>
             <w:r>
               <w:rPr>
@@ -1304,10 +1428,186 @@
                 <w:szCs w:val="19"/>
                 <w:shd w:val="clear" w:color="auto" w:fill="F2F2F2"/>
               </w:rPr>
+              <w:t xml:space="preserve">--&gt;</w:t>
+            </w:r>
+            <w:r>
+              <w:t xml:space="preserve"> is a note for whoever reads the code. The browser skips it completely, so it never appears on the page. We used comments to label each row.</w:t>
+            </w:r>
+          </w:p>
+        </w:tc>
+      </w:tr>
+      <w:tr>
+        <w:trPr>
+          <w:cantSplit/>
+        </w:trPr>
+        <w:tc>
+          <w:tcPr>
+            <w:tcW w:w="3100" w:type="dxa"/>
+            <w:shd w:val="clear" w:color="auto" w:fill="F7F9FC"/>
+          </w:tcPr>
+          <w:p>
+            <w:pPr>
+              <w:spacing w:before="0" w:after="0"/>
+            </w:pPr>
+            <w:r>
+              <w:rPr>
+                <w:rFonts w:ascii="Consolas" w:hAnsi="Consolas" w:cs="Consolas"/>
+                <w:sz w:val="18"/>
+                <w:szCs w:val="18"/>
+                <w:shd w:val="clear" w:color="auto" w:fill="F2F2F2"/>
+              </w:rPr>
+              <w:t xml:space="preserve">&lt;tr&gt;</w:t>
+            </w:r>
+          </w:p>
+        </w:tc>
+        <w:tc>
+          <w:tcPr>
+            <w:tcW w:w="5926" w:type="dxa"/>
+          </w:tcPr>
+          <w:p>
+            <w:pPr>
+              <w:spacing w:before="0" w:after="0"/>
+            </w:pPr>
+            <w:r>
+              <w:t xml:space="preserve">Starts the first row of the table.</w:t>
+            </w:r>
+          </w:p>
+        </w:tc>
+      </w:tr>
+      <w:tr>
+        <w:trPr>
+          <w:cantSplit/>
+        </w:trPr>
+        <w:tc>
+          <w:tcPr>
+            <w:tcW w:w="3100" w:type="dxa"/>
+            <w:shd w:val="clear" w:color="auto" w:fill="F7F9FC"/>
+          </w:tcPr>
+          <w:p>
+            <w:pPr>
+              <w:spacing w:before="0" w:after="0"/>
+            </w:pPr>
+            <w:r>
+              <w:rPr>
+                <w:rFonts w:ascii="Consolas" w:hAnsi="Consolas" w:cs="Consolas"/>
+                <w:sz w:val="18"/>
+                <w:szCs w:val="18"/>
+                <w:shd w:val="clear" w:color="auto" w:fill="F2F2F2"/>
+              </w:rPr>
+              <w:t xml:space="preserve">&lt;th colspan="3"&gt;</w:t>
+            </w:r>
+          </w:p>
+        </w:tc>
+        <w:tc>
+          <w:tcPr>
+            <w:tcW w:w="5926" w:type="dxa"/>
+          </w:tcPr>
+          <w:p>
+            <w:pPr>
+              <w:spacing w:before="0" w:after="0"/>
+            </w:pPr>
+            <w:r>
+              <w:t xml:space="preserve">A header box. </w:t>
+            </w:r>
+            <w:r>
+              <w:rPr>
+                <w:rFonts w:ascii="Consolas" w:hAnsi="Consolas" w:cs="Consolas"/>
+                <w:sz w:val="19"/>
+                <w:szCs w:val="19"/>
+                <w:shd w:val="clear" w:color="auto" w:fill="F2F2F2"/>
+              </w:rPr>
+              <w:t xml:space="preserve">colspan="3"</w:t>
+            </w:r>
+            <w:r>
+              <w:t xml:space="preserve"> means "make this box as wide as 3 boxes". It's like merging 3 cells together in Excel. That's why "CSIT128: Assignment 1" stretches across most of the top of the table.</w:t>
+            </w:r>
+          </w:p>
+        </w:tc>
+      </w:tr>
+      <w:tr>
+        <w:trPr>
+          <w:cantSplit/>
+        </w:trPr>
+        <w:tc>
+          <w:tcPr>
+            <w:tcW w:w="3100" w:type="dxa"/>
+            <w:shd w:val="clear" w:color="auto" w:fill="F7F9FC"/>
+          </w:tcPr>
+          <w:p>
+            <w:pPr>
+              <w:spacing w:before="0" w:after="0"/>
+            </w:pPr>
+            <w:r>
+              <w:rPr>
+                <w:rFonts w:ascii="Consolas" w:hAnsi="Consolas" w:cs="Consolas"/>
+                <w:sz w:val="18"/>
+                <w:szCs w:val="18"/>
+                <w:shd w:val="clear" w:color="auto" w:fill="F2F2F2"/>
+              </w:rPr>
+              <w:t xml:space="preserve">&lt;th&gt;Group n0h4ts&lt;/th&gt;</w:t>
+            </w:r>
+          </w:p>
+        </w:tc>
+        <w:tc>
+          <w:tcPr>
+            <w:tcW w:w="5926" w:type="dxa"/>
+          </w:tcPr>
+          <w:p>
+            <w:pPr>
+              <w:spacing w:before="0" w:after="0"/>
+            </w:pPr>
+            <w:r>
+              <w:t xml:space="preserve">The second header box, which fills the last (4th) column. Our table has 4 columns, so every row must add up to 4: here that's 3 (the merged box) + 1 = 4.</w:t>
+            </w:r>
+          </w:p>
+        </w:tc>
+      </w:tr>
+      <w:tr>
+        <w:trPr>
+          <w:cantSplit/>
+        </w:trPr>
+        <w:tc>
+          <w:tcPr>
+            <w:tcW w:w="3100" w:type="dxa"/>
+            <w:shd w:val="clear" w:color="auto" w:fill="F7F9FC"/>
+          </w:tcPr>
+          <w:p>
+            <w:pPr>
+              <w:spacing w:before="0" w:after="0"/>
+            </w:pPr>
+            <w:r>
+              <w:rPr>
+                <w:rFonts w:ascii="Consolas" w:hAnsi="Consolas" w:cs="Consolas"/>
+                <w:sz w:val="18"/>
+                <w:szCs w:val="18"/>
+                <w:shd w:val="clear" w:color="auto" w:fill="F2F2F2"/>
+              </w:rPr>
+              <w:t xml:space="preserve">background-color: #C6D9F1</w:t>
+            </w:r>
+          </w:p>
+        </w:tc>
+        <w:tc>
+          <w:tcPr>
+            <w:tcW w:w="5926" w:type="dxa"/>
+          </w:tcPr>
+          <w:p>
+            <w:pPr>
+              <w:spacing w:before="0" w:after="0"/>
+            </w:pPr>
+            <w:r>
+              <w:t xml:space="preserve">Colours the box light blue. </w:t>
+            </w:r>
+            <w:r>
+              <w:rPr>
+                <w:rFonts w:ascii="Consolas" w:hAnsi="Consolas" w:cs="Consolas"/>
+                <w:sz w:val="19"/>
+                <w:szCs w:val="19"/>
+                <w:shd w:val="clear" w:color="auto" w:fill="F2F2F2"/>
+              </w:rPr>
               <w:t xml:space="preserve">#C6D9F1</w:t>
             </w:r>
             <w:r>
-              <w:t xml:space="preserve"> is a hex colour code.</w:t>
+              <w:t xml:space="preserve"> is a colour code: the browser turns these letters and numbers into one exact colour.</w:t>
             </w:r>
           </w:p>
         </w:tc>
@@ -1345,7 +1645,45 @@
               <w:spacing w:before="0" w:after="0"/>
             </w:pPr>
             <w:r>
-              <w:t xml:space="preserve">Makes the header text bigger (20 pixels) so it stands out as the title.</w:t>
+              <w:t xml:space="preserve">Makes the text in these boxes bigger (20 pixels tall) so the title row stands out.</w:t>
+            </w:r>
+          </w:p>
+        </w:tc>
+      </w:tr>
+      <w:tr>
+        <w:trPr>
+          <w:cantSplit/>
+        </w:trPr>
+        <w:tc>
+          <w:tcPr>
+            <w:tcW w:w="3100" w:type="dxa"/>
+            <w:shd w:val="clear" w:color="auto" w:fill="F7F9FC"/>
+          </w:tcPr>
+          <w:p>
+            <w:pPr>
+              <w:spacing w:before="0" w:after="0"/>
+            </w:pPr>
+            <w:r>
+              <w:rPr>
+                <w:rFonts w:ascii="Consolas" w:hAnsi="Consolas" w:cs="Consolas"/>
+                <w:sz w:val="18"/>
+                <w:szCs w:val="18"/>
+                <w:shd w:val="clear" w:color="auto" w:fill="F2F2F2"/>
+              </w:rPr>
+              <w:t xml:space="preserve">&lt;/tr&gt;</w:t>
+            </w:r>
+          </w:p>
+        </w:tc>
+        <w:tc>
+          <w:tcPr>
+            <w:tcW w:w="5926" w:type="dxa"/>
+          </w:tcPr>
+          <w:p>
+            <w:pPr>
+              <w:spacing w:before="0" w:after="0"/>
+            </w:pPr>
+            <w:r>
+              <w:t xml:space="preserve">Ends the first row.</w:t>
             </w:r>
           </w:p>
         </w:tc>
@@ -1361,7 +1699,7 @@
         <w:pStyle w:val="Heading2"/>
       </w:pPr>
       <w:r>
-        <w:t xml:space="preserve">1.4 Row 2 – the label and first member (lines 19–25)</w:t>
+        <w:t xml:space="preserve">1.4 Row 2 – the label and the first member (lines 19–25)</w:t>
       </w:r>
     </w:p>
     <w:p>
@@ -1418,7 +1756,7 @@
         <w:t xml:space="preserve">Figure 5: </w:t>
       </w:r>
       <w:r>
-        <w:t xml:space="preserve">Row 2: the label cell and Michael's details</w:t>
+        <w:t xml:space="preserve">Row 2: the label box and Michael's details</w:t>
       </w:r>
     </w:p>
     <w:tbl>
@@ -1480,7 +1818,7 @@
               <w:rPr>
                 <w:b/>
               </w:rPr>
-              <w:t xml:space="preserve">What it does</w:t>
+              <w:t xml:space="preserve">What it means</w:t>
             </w:r>
           </w:p>
         </w:tc>
@@ -1518,7 +1856,7 @@
               <w:spacing w:before="0" w:after="0"/>
             </w:pPr>
             <w:r>
-              <w:t xml:space="preserve">Makes the "Student Number / Name / Email" cell </w:t>
+              <w:t xml:space="preserve">Makes the "Student Number / Name / Email" box </w:t>
             </w:r>
             <w:r>
               <w:rPr>
@@ -1527,7 +1865,19 @@
               <w:t xml:space="preserve">2 rows tall</w:t>
             </w:r>
             <w:r>
-              <w:t xml:space="preserve">, so it covers row 2 and row 3. That way one label works for both members.</w:t>
+              <w:t xml:space="preserve">. It's the same idea as </w:t>
+            </w:r>
+            <w:r>
+              <w:rPr>
+                <w:rFonts w:ascii="Consolas" w:hAnsi="Consolas" w:cs="Consolas"/>
+                <w:sz w:val="19"/>
+                <w:szCs w:val="19"/>
+                <w:shd w:val="clear" w:color="auto" w:fill="F2F2F2"/>
+              </w:rPr>
+              <w:t xml:space="preserve">colspan</w:t>
+            </w:r>
+            <w:r>
+              <w:t xml:space="preserve">, but downwards instead of sideways. This one label box sits beside both group members' details, so we don't need to write it twice.</w:t>
             </w:r>
           </w:p>
         </w:tc>
@@ -1565,7 +1915,7 @@
               <w:spacing w:before="0" w:after="0"/>
             </w:pPr>
             <w:r>
-              <w:t xml:space="preserve">A line break inside the cell. It moves "Name / Email" onto a new line.</w:t>
+              <w:t xml:space="preserve">Short for "line break". It's like pressing Enter: the text after it ("Name / Email") starts on a new line.</w:t>
             </w:r>
           </w:p>
         </w:tc>
@@ -1603,7 +1953,7 @@
               <w:spacing w:before="0" w:after="0"/>
             </w:pPr>
             <w:r>
-              <w:t xml:space="preserve">Lines the text up against the left side of the cell.</w:t>
+              <w:t xml:space="preserve">Lines the text up against the left side of its box, like left-aligned text in Word.</w:t>
             </w:r>
           </w:p>
         </w:tc>
@@ -1641,7 +1991,45 @@
               <w:spacing w:before="0" w:after="0"/>
             </w:pPr>
             <w:r>
-              <w:t xml:space="preserve">Sets how wide each column is, as a percentage of the table. 25 + 15 + 25 + 35 = 100%. We only need to set this once (in row 2) because the columns below line up with it.</w:t>
+              <w:t xml:space="preserve">Sets how wide each of the 4 columns is, as a share of the table's width. They add up to 100% (25 + 15 + 25 + 35). We only set this in row 2 because every box below lines up with the box above it.</w:t>
+            </w:r>
+          </w:p>
+        </w:tc>
+      </w:tr>
+      <w:tr>
+        <w:trPr>
+          <w:cantSplit/>
+        </w:trPr>
+        <w:tc>
+          <w:tcPr>
+            <w:tcW w:w="3100" w:type="dxa"/>
+            <w:shd w:val="clear" w:color="auto" w:fill="F7F9FC"/>
+          </w:tcPr>
+          <w:p>
+            <w:pPr>
+              <w:spacing w:before="0" w:after="0"/>
+            </w:pPr>
+            <w:r>
+              <w:rPr>
+                <w:rFonts w:ascii="Consolas" w:hAnsi="Consolas" w:cs="Consolas"/>
+                <w:sz w:val="18"/>
+                <w:szCs w:val="18"/>
+                <w:shd w:val="clear" w:color="auto" w:fill="F2F2F2"/>
+              </w:rPr>
+              <w:t xml:space="preserve">1778481 … mnchan002@uowmail.edu.au</w:t>
+            </w:r>
+          </w:p>
+        </w:tc>
+        <w:tc>
+          <w:tcPr>
+            <w:tcW w:w="5926" w:type="dxa"/>
+          </w:tcPr>
+          <w:p>
+            <w:pPr>
+              <w:spacing w:before="0" w:after="0"/>
+            </w:pPr>
+            <w:r>
+              <w:t xml:space="preserve">The actual details for the first member: student number, name and email, each in its own box.</w:t>
             </w:r>
           </w:p>
         </w:tc>
@@ -1679,7 +2067,7 @@
               <w:spacing w:before="0" w:after="0"/>
             </w:pPr>
             <w:r>
-              <w:t xml:space="preserve">Stops "Michael Nathaniel Chan" from wrapping onto two lines, so the full name stays on one line.</w:t>
+              <w:t xml:space="preserve">"No wrap" means "don't split this text onto two lines". It keeps "Michael Nathaniel Chan" on one line, even when the box is narrow.</w:t>
             </w:r>
           </w:p>
         </w:tc>
@@ -1814,7 +2202,7 @@
               <w:rPr>
                 <w:b/>
               </w:rPr>
-              <w:t xml:space="preserve">What it does</w:t>
+              <w:t xml:space="preserve">What it means</w:t>
             </w:r>
           </w:p>
         </w:tc>
@@ -1852,57 +2240,45 @@
               <w:spacing w:before="0" w:after="0"/>
             </w:pPr>
             <w:r>
-              <w:t xml:space="preserve">Makes this row 80 pixels tall. Because the label cell spans rows 2 and 3, it also gets taller.</w:t>
-            </w:r>
-          </w:p>
-        </w:tc>
-      </w:tr>
-      <w:tr>
-        <w:trPr>
-          <w:cantSplit/>
-        </w:trPr>
-        <w:tc>
-          <w:tcPr>
-            <w:tcW w:w="3100" w:type="dxa"/>
-            <w:shd w:val="clear" w:color="auto" w:fill="F7F9FC"/>
-          </w:tcPr>
-          <w:p>
-            <w:pPr>
-              <w:spacing w:before="0" w:after="0"/>
-            </w:pPr>
-            <w:r>
-              <w:rPr>
-                <w:rFonts w:ascii="Consolas" w:hAnsi="Consolas" w:cs="Consolas"/>
-                <w:sz w:val="18"/>
-                <w:szCs w:val="18"/>
-                <w:shd w:val="clear" w:color="auto" w:fill="F2F2F2"/>
-              </w:rPr>
-              <w:t xml:space="preserve">Only 3 &lt;td&gt; cells</w:t>
-            </w:r>
-          </w:p>
-        </w:tc>
-        <w:tc>
-          <w:tcPr>
-            <w:tcW w:w="5926" w:type="dxa"/>
-          </w:tcPr>
-          <w:p>
-            <w:pPr>
-              <w:spacing w:before="0" w:after="0"/>
-            </w:pPr>
-            <w:r>
-              <w:t xml:space="preserve">Row 3 only needs 3 cells because column 1 is already filled by the </w:t>
-            </w:r>
-            <w:r>
-              <w:rPr>
-                <w:rFonts w:ascii="Consolas" w:hAnsi="Consolas" w:cs="Consolas"/>
-                <w:sz w:val="19"/>
-                <w:szCs w:val="19"/>
-                <w:shd w:val="clear" w:color="auto" w:fill="F2F2F2"/>
-              </w:rPr>
-              <w:t xml:space="preserve">rowspan="2"</w:t>
-            </w:r>
-            <w:r>
-              <w:t xml:space="preserve"> cell from row 2. A 4th cell here would push an extra column out of the side of the table.</w:t>
+              <w:t xml:space="preserve">Starts the third row and makes it 80 pixels tall. The label box on the left also gets taller, because it stretches across both rows 2 and 3.</w:t>
+            </w:r>
+          </w:p>
+        </w:tc>
+      </w:tr>
+      <w:tr>
+        <w:trPr>
+          <w:cantSplit/>
+        </w:trPr>
+        <w:tc>
+          <w:tcPr>
+            <w:tcW w:w="3100" w:type="dxa"/>
+            <w:shd w:val="clear" w:color="auto" w:fill="F7F9FC"/>
+          </w:tcPr>
+          <w:p>
+            <w:pPr>
+              <w:spacing w:before="0" w:after="0"/>
+            </w:pPr>
+            <w:r>
+              <w:rPr>
+                <w:rFonts w:ascii="Consolas" w:hAnsi="Consolas" w:cs="Consolas"/>
+                <w:sz w:val="18"/>
+                <w:szCs w:val="18"/>
+                <w:shd w:val="clear" w:color="auto" w:fill="F2F2F2"/>
+              </w:rPr>
+              <w:t xml:space="preserve">Only 3 &lt;td&gt; boxes</w:t>
+            </w:r>
+          </w:p>
+        </w:tc>
+        <w:tc>
+          <w:tcPr>
+            <w:tcW w:w="5926" w:type="dxa"/>
+          </w:tcPr>
+          <w:p>
+            <w:pPr>
+              <w:spacing w:before="0" w:after="0"/>
+            </w:pPr>
+            <w:r>
+              <w:t xml:space="preserve">This row only has 3 boxes instead of 4. That's because the first column is already taken by the tall label box from row 2. If we added a 4th box here, it would stick out past the edge of the table.</w:t>
             </w:r>
           </w:p>
         </w:tc>
@@ -1940,7 +2316,7 @@
               <w:spacing w:before="0" w:after="0"/>
             </w:pPr>
             <w:r>
-              <w:t xml:space="preserve">Closes the table.</w:t>
+              <w:t xml:space="preserve">Ends the table.</w:t>
             </w:r>
           </w:p>
         </w:tc>
@@ -1953,31 +2329,7 @@
     </w:p>
     <w:p>
       <w:r>
-        <w:t xml:space="preserve">This diagram shows how </w:t>
-      </w:r>
-      <w:r>
-        <w:rPr>
-          <w:rFonts w:ascii="Consolas" w:hAnsi="Consolas" w:cs="Consolas"/>
-          <w:sz w:val="19"/>
-          <w:szCs w:val="19"/>
-          <w:shd w:val="clear" w:color="auto" w:fill="F2F2F2"/>
-        </w:rPr>
-        <w:t xml:space="preserve">colspan</w:t>
-      </w:r>
-      <w:r>
-        <w:t xml:space="preserve"> and </w:t>
-      </w:r>
-      <w:r>
-        <w:rPr>
-          <w:rFonts w:ascii="Consolas" w:hAnsi="Consolas" w:cs="Consolas"/>
-          <w:sz w:val="19"/>
-          <w:szCs w:val="19"/>
-          <w:shd w:val="clear" w:color="auto" w:fill="F2F2F2"/>
-        </w:rPr>
-        <w:t xml:space="preserve">rowspan</w:t>
-      </w:r>
-      <w:r>
-        <w:t xml:space="preserve"> fit together to make the 4-column grid:</w:t>
+        <w:t xml:space="preserve">This diagram shows how the merged boxes fit together to make a neat 4-column table:</w:t>
       </w:r>
     </w:p>
     <w:tbl>
@@ -2269,7 +2621,7 @@
     </w:p>
     <w:p>
       <w:r>
-        <w:t xml:space="preserve">Part 2 shows a "Hello World" program in four languages: C++, C#, Python and HTML. Each language has a heading, a logo, and the code next to the logo. A list of links at the top lets the user jump straight to any language.</w:t>
+        <w:t xml:space="preserve">A "Hello World" program is the simplest program you can write: it just shows the words "Hello World". Part 2 shows this program in four languages: C++, C#, Python and HTML. Each language has a heading, its logo, and the code shown next to the logo. At the top, there is a list of links that jump straight to each language.</w:t>
       </w:r>
     </w:p>
     <w:p>
@@ -2277,7 +2629,7 @@
         <w:pStyle w:val="Heading2"/>
       </w:pPr>
       <w:r>
-        <w:t xml:space="preserve">2.1 Heading and navigation links (lines 34–42)</w:t>
+        <w:t xml:space="preserve">2.1 The heading and the jump links (lines 34–42)</w:t>
       </w:r>
     </w:p>
     <w:p>
@@ -2396,7 +2748,7 @@
               <w:rPr>
                 <w:b/>
               </w:rPr>
-              <w:t xml:space="preserve">What it does</w:t>
+              <w:t xml:space="preserve">What it means</w:t>
             </w:r>
           </w:p>
         </w:tc>
@@ -2434,7 +2786,7 @@
               <w:spacing w:before="0" w:after="0"/>
             </w:pPr>
             <w:r>
-              <w:t xml:space="preserve">Unordered list. It shows its items as bullet points.</w:t>
+              <w:t xml:space="preserve">Starts a bullet-point list. "ul" stands for "unordered list", meaning the items have bullet points instead of numbers.</w:t>
             </w:r>
           </w:p>
         </w:tc>
@@ -2472,8 +2824,81 @@
               <w:spacing w:before="0" w:after="0"/>
             </w:pPr>
             <w:r>
-              <w:t xml:space="preserve">List item. Each </w:t>
-            </w:r>
+              <w:t xml:space="preserve">One item (one bullet point) in the list. We have 4 items, one for each language.</w:t>
+            </w:r>
+          </w:p>
+        </w:tc>
+      </w:tr>
+      <w:tr>
+        <w:trPr>
+          <w:cantSplit/>
+        </w:trPr>
+        <w:tc>
+          <w:tcPr>
+            <w:tcW w:w="3100" w:type="dxa"/>
+            <w:shd w:val="clear" w:color="auto" w:fill="F7F9FC"/>
+          </w:tcPr>
+          <w:p>
+            <w:pPr>
+              <w:spacing w:before="0" w:after="0"/>
+            </w:pPr>
+            <w:r>
+              <w:rPr>
+                <w:rFonts w:ascii="Consolas" w:hAnsi="Consolas" w:cs="Consolas"/>
+                <w:sz w:val="18"/>
+                <w:szCs w:val="18"/>
+                <w:shd w:val="clear" w:color="auto" w:fill="F2F2F2"/>
+              </w:rPr>
+              <w:t xml:space="preserve">&lt;a&gt; … &lt;/a&gt;</w:t>
+            </w:r>
+          </w:p>
+        </w:tc>
+        <w:tc>
+          <w:tcPr>
+            <w:tcW w:w="5926" w:type="dxa"/>
+          </w:tcPr>
+          <w:p>
+            <w:pPr>
+              <w:spacing w:before="0" w:after="0"/>
+            </w:pPr>
+            <w:r>
+              <w:t xml:space="preserve">A link: something the user can click. The text between the tags (like "C++") is the part that shows up blue and underlined.</w:t>
+            </w:r>
+          </w:p>
+        </w:tc>
+      </w:tr>
+      <w:tr>
+        <w:trPr>
+          <w:cantSplit/>
+        </w:trPr>
+        <w:tc>
+          <w:tcPr>
+            <w:tcW w:w="3100" w:type="dxa"/>
+            <w:shd w:val="clear" w:color="auto" w:fill="F7F9FC"/>
+          </w:tcPr>
+          <w:p>
+            <w:pPr>
+              <w:spacing w:before="0" w:after="0"/>
+            </w:pPr>
+            <w:r>
+              <w:rPr>
+                <w:rFonts w:ascii="Consolas" w:hAnsi="Consolas" w:cs="Consolas"/>
+                <w:sz w:val="18"/>
+                <w:szCs w:val="18"/>
+                <w:shd w:val="clear" w:color="auto" w:fill="F2F2F2"/>
+              </w:rPr>
+              <w:t xml:space="preserve">href="#cpp"</w:t>
+            </w:r>
+          </w:p>
+        </w:tc>
+        <w:tc>
+          <w:tcPr>
+            <w:tcW w:w="5926" w:type="dxa"/>
+          </w:tcPr>
+          <w:p>
+            <w:pPr>
+              <w:spacing w:before="0" w:after="0"/>
+            </w:pPr>
             <w:r>
               <w:rPr>
                 <w:rFonts w:ascii="Consolas" w:hAnsi="Consolas" w:cs="Consolas"/>
@@ -2481,48 +2906,10 @@
                 <w:szCs w:val="19"/>
                 <w:shd w:val="clear" w:color="auto" w:fill="F2F2F2"/>
               </w:rPr>
-              <w:t xml:space="preserve">&lt;li&gt;</w:t>
-            </w:r>
-            <w:r>
-              <w:t xml:space="preserve"> is one bullet point.</w:t>
-            </w:r>
-          </w:p>
-        </w:tc>
-      </w:tr>
-      <w:tr>
-        <w:trPr>
-          <w:cantSplit/>
-        </w:trPr>
-        <w:tc>
-          <w:tcPr>
-            <w:tcW w:w="3100" w:type="dxa"/>
-            <w:shd w:val="clear" w:color="auto" w:fill="F7F9FC"/>
-          </w:tcPr>
-          <w:p>
-            <w:pPr>
-              <w:spacing w:before="0" w:after="0"/>
-            </w:pPr>
-            <w:r>
-              <w:rPr>
-                <w:rFonts w:ascii="Consolas" w:hAnsi="Consolas" w:cs="Consolas"/>
-                <w:sz w:val="18"/>
-                <w:szCs w:val="18"/>
-                <w:shd w:val="clear" w:color="auto" w:fill="F2F2F2"/>
-              </w:rPr>
-              <w:t xml:space="preserve">&lt;a href="#cpp"&gt;C++&lt;/a&gt;</w:t>
-            </w:r>
-          </w:p>
-        </w:tc>
-        <w:tc>
-          <w:tcPr>
-            <w:tcW w:w="5926" w:type="dxa"/>
-          </w:tcPr>
-          <w:p>
-            <w:pPr>
-              <w:spacing w:before="0" w:after="0"/>
-            </w:pPr>
-            <w:r>
-              <w:t xml:space="preserve">A link. The </w:t>
+              <w:t xml:space="preserve">href</w:t>
+            </w:r>
+            <w:r>
+              <w:t xml:space="preserve"> tells the link where to go. Starting with </w:t>
             </w:r>
             <w:r>
               <w:rPr>
@@ -2534,7 +2921,7 @@
               <w:t xml:space="preserve">#</w:t>
             </w:r>
             <w:r>
-              <w:t xml:space="preserve"> means "jump to something on </w:t>
+              <w:t xml:space="preserve"> means "go to a place on </w:t>
             </w:r>
             <w:r>
               <w:rPr>
@@ -2543,7 +2930,7 @@
               <w:t xml:space="preserve">this same page</w:t>
             </w:r>
             <w:r>
-              <w:t xml:space="preserve">" that has </w:t>
+              <w:t xml:space="preserve">" instead of a different website. </w:t>
             </w:r>
             <w:r>
               <w:rPr>
@@ -2552,48 +2939,10 @@
                 <w:szCs w:val="19"/>
                 <w:shd w:val="clear" w:color="auto" w:fill="F2F2F2"/>
               </w:rPr>
-              <w:t xml:space="preserve">id="cpp"</w:t>
-            </w:r>
-            <w:r>
-              <w:t xml:space="preserve">. Clicking "C++" scrolls down to the C++ section.</w:t>
-            </w:r>
-          </w:p>
-        </w:tc>
-      </w:tr>
-      <w:tr>
-        <w:trPr>
-          <w:cantSplit/>
-        </w:trPr>
-        <w:tc>
-          <w:tcPr>
-            <w:tcW w:w="3100" w:type="dxa"/>
-            <w:shd w:val="clear" w:color="auto" w:fill="F7F9FC"/>
-          </w:tcPr>
-          <w:p>
-            <w:pPr>
-              <w:spacing w:before="0" w:after="0"/>
-            </w:pPr>
-            <w:r>
-              <w:rPr>
-                <w:rFonts w:ascii="Consolas" w:hAnsi="Consolas" w:cs="Consolas"/>
-                <w:sz w:val="18"/>
-                <w:szCs w:val="18"/>
-                <w:shd w:val="clear" w:color="auto" w:fill="F2F2F2"/>
-              </w:rPr>
-              <w:t xml:space="preserve">#cpp, #csharp, #python, #html</w:t>
-            </w:r>
-          </w:p>
-        </w:tc>
-        <w:tc>
-          <w:tcPr>
-            <w:tcW w:w="5926" w:type="dxa"/>
-          </w:tcPr>
-          <w:p>
-            <w:pPr>
-              <w:spacing w:before="0" w:after="0"/>
-            </w:pPr>
-            <w:r>
-              <w:t xml:space="preserve">Each link matches the </w:t>
+              <w:t xml:space="preserve">#cpp</w:t>
+            </w:r>
+            <w:r>
+              <w:t xml:space="preserve"> jumps to whatever has the name tag </w:t>
             </w:r>
             <w:r>
               <w:rPr>
@@ -2602,10 +2951,48 @@
                 <w:szCs w:val="19"/>
                 <w:shd w:val="clear" w:color="auto" w:fill="F2F2F2"/>
               </w:rPr>
-              <w:t xml:space="preserve">id</w:t>
-            </w:r>
-            <w:r>
-              <w:t xml:space="preserve"> of one section heading further down (for example, </w:t>
+              <w:t xml:space="preserve">id="cpp"</w:t>
+            </w:r>
+            <w:r>
+              <w:t xml:space="preserve">, which is the C++ heading further down.</w:t>
+            </w:r>
+          </w:p>
+        </w:tc>
+      </w:tr>
+      <w:tr>
+        <w:trPr>
+          <w:cantSplit/>
+        </w:trPr>
+        <w:tc>
+          <w:tcPr>
+            <w:tcW w:w="3100" w:type="dxa"/>
+            <w:shd w:val="clear" w:color="auto" w:fill="F7F9FC"/>
+          </w:tcPr>
+          <w:p>
+            <w:pPr>
+              <w:spacing w:before="0" w:after="0"/>
+            </w:pPr>
+            <w:r>
+              <w:rPr>
+                <w:rFonts w:ascii="Consolas" w:hAnsi="Consolas" w:cs="Consolas"/>
+                <w:sz w:val="18"/>
+                <w:szCs w:val="18"/>
+                <w:shd w:val="clear" w:color="auto" w:fill="F2F2F2"/>
+              </w:rPr>
+              <w:t xml:space="preserve">#csharp, #python, #html</w:t>
+            </w:r>
+          </w:p>
+        </w:tc>
+        <w:tc>
+          <w:tcPr>
+            <w:tcW w:w="5926" w:type="dxa"/>
+          </w:tcPr>
+          <w:p>
+            <w:pPr>
+              <w:spacing w:before="0" w:after="0"/>
+            </w:pPr>
+            <w:r>
+              <w:t xml:space="preserve">The other links work the same way. Each one jumps to the heading with the matching name. We used "csharp" instead of "c#" because </w:t>
             </w:r>
             <w:r>
               <w:rPr>
@@ -2614,34 +3001,10 @@
                 <w:szCs w:val="19"/>
                 <w:shd w:val="clear" w:color="auto" w:fill="F2F2F2"/>
               </w:rPr>
-              <w:t xml:space="preserve">#csharp</w:t>
-            </w:r>
-            <w:r>
-              <w:t xml:space="preserve"> jumps to </w:t>
-            </w:r>
-            <w:r>
-              <w:rPr>
-                <w:rFonts w:ascii="Consolas" w:hAnsi="Consolas" w:cs="Consolas"/>
-                <w:sz w:val="19"/>
-                <w:szCs w:val="19"/>
-                <w:shd w:val="clear" w:color="auto" w:fill="F2F2F2"/>
-              </w:rPr>
-              <w:t xml:space="preserve">&lt;h3 id="csharp"&gt;</w:t>
-            </w:r>
-            <w:r>
-              <w:t xml:space="preserve">). We wrote "csharp" instead of "c#" because the </w:t>
-            </w:r>
-            <w:r>
-              <w:rPr>
-                <w:rFonts w:ascii="Consolas" w:hAnsi="Consolas" w:cs="Consolas"/>
-                <w:sz w:val="19"/>
-                <w:szCs w:val="19"/>
-                <w:shd w:val="clear" w:color="auto" w:fill="F2F2F2"/>
-              </w:rPr>
               <w:t xml:space="preserve">#</w:t>
             </w:r>
             <w:r>
-              <w:t xml:space="preserve"> symbol already has a special meaning in links.</w:t>
+              <w:t xml:space="preserve"> already means "on this page" in a link, so using it in the name too would confuse the browser.</w:t>
             </w:r>
           </w:p>
         </w:tc>
@@ -2679,7 +3042,7 @@
               <w:spacing w:before="0" w:after="0"/>
             </w:pPr>
             <w:r>
-              <w:t xml:space="preserve">A line separating the list from the first language section.</w:t>
+              <w:t xml:space="preserve">A line separating the list from the first language.</w:t>
             </w:r>
           </w:p>
         </w:tc>
@@ -2757,7 +3120,7 @@
     </w:p>
     <w:p>
       <w:r>
-        <w:t xml:space="preserve">All four language sections are built the same way, so this one explains the layout in detail.</w:t>
+        <w:t xml:space="preserve">All four language sections are built in the same way, so this first one is explained in the most detail.</w:t>
       </w:r>
     </w:p>
     <w:tbl>
@@ -2819,7 +3182,45 @@
               <w:rPr>
                 <w:b/>
               </w:rPr>
-              <w:t xml:space="preserve">What it does</w:t>
+              <w:t xml:space="preserve">What it means</w:t>
+            </w:r>
+          </w:p>
+        </w:tc>
+      </w:tr>
+      <w:tr>
+        <w:trPr>
+          <w:cantSplit/>
+        </w:trPr>
+        <w:tc>
+          <w:tcPr>
+            <w:tcW w:w="3100" w:type="dxa"/>
+            <w:shd w:val="clear" w:color="auto" w:fill="F7F9FC"/>
+          </w:tcPr>
+          <w:p>
+            <w:pPr>
+              <w:spacing w:before="0" w:after="0"/>
+            </w:pPr>
+            <w:r>
+              <w:rPr>
+                <w:rFonts w:ascii="Consolas" w:hAnsi="Consolas" w:cs="Consolas"/>
+                <w:sz w:val="18"/>
+                <w:szCs w:val="18"/>
+                <w:shd w:val="clear" w:color="auto" w:fill="F2F2F2"/>
+              </w:rPr>
+              <w:t xml:space="preserve">&lt;!-- C++ Section --&gt;</w:t>
+            </w:r>
+          </w:p>
+        </w:tc>
+        <w:tc>
+          <w:tcPr>
+            <w:tcW w:w="5926" w:type="dxa"/>
+          </w:tcPr>
+          <w:p>
+            <w:pPr>
+              <w:spacing w:before="0" w:after="0"/>
+            </w:pPr>
+            <w:r>
+              <w:t xml:space="preserve">A comment labelling this section, so we can find it easily in our code. It doesn't show on the page.</w:t>
             </w:r>
           </w:p>
         </w:tc>
@@ -2857,7 +3258,7 @@
               <w:spacing w:before="0" w:after="0"/>
             </w:pPr>
             <w:r>
-              <w:t xml:space="preserve">A smaller heading for the language name. The </w:t>
+              <w:t xml:space="preserve">A smaller heading (size 3) showing the language name. </w:t>
             </w:r>
             <w:r>
               <w:rPr>
@@ -2866,10 +3267,10 @@
                 <w:szCs w:val="19"/>
                 <w:shd w:val="clear" w:color="auto" w:fill="F2F2F2"/>
               </w:rPr>
-              <w:t xml:space="preserve">id</w:t>
-            </w:r>
-            <w:r>
-              <w:t xml:space="preserve"> gives the heading a name so the </w:t>
+              <w:t xml:space="preserve">id="cpp"</w:t>
+            </w:r>
+            <w:r>
+              <w:t xml:space="preserve"> gives the heading a unique name, like a name tag. This is what the </w:t>
             </w:r>
             <w:r>
               <w:rPr>
@@ -2881,7 +3282,7 @@
               <w:t xml:space="preserve">#cpp</w:t>
             </w:r>
             <w:r>
-              <w:t xml:space="preserve"> link at the top can jump to it. Each </w:t>
+              <w:t xml:space="preserve"> link at the top looks for. Two things on the same page can't share an </w:t>
             </w:r>
             <w:r>
               <w:rPr>
@@ -2893,7 +3294,7 @@
               <w:t xml:space="preserve">id</w:t>
             </w:r>
             <w:r>
-              <w:t xml:space="preserve"> must be unique on the page.</w:t>
+              <w:t xml:space="preserve">.</w:t>
             </w:r>
           </w:p>
         </w:tc>
@@ -2931,7 +3332,7 @@
               <w:spacing w:before="0" w:after="0"/>
             </w:pPr>
             <w:r>
-              <w:t xml:space="preserve">A container box. It groups the logo and the code so we can style them together.</w:t>
+              <w:t xml:space="preserve">An invisible box that groups things together. Here it holds the logo and the code, so we can arrange them as a pair.</w:t>
             </w:r>
           </w:p>
         </w:tc>
@@ -2969,130 +3370,7 @@
               <w:spacing w:before="0" w:after="0"/>
             </w:pPr>
             <w:r>
-              <w:t xml:space="preserve">Turns the div into a flexbox container. Normally the image and the code would stack on top of each other. Flexbox puts them </w:t>
-            </w:r>
-            <w:r>
-              <w:rPr>
-                <w:b/>
-              </w:rPr>
-              <w:t xml:space="preserve">side by side</w:t>
-            </w:r>
-            <w:r>
-              <w:t xml:space="preserve"> in a row.</w:t>
-            </w:r>
-          </w:p>
-        </w:tc>
-      </w:tr>
-      <w:tr>
-        <w:trPr>
-          <w:cantSplit/>
-        </w:trPr>
-        <w:tc>
-          <w:tcPr>
-            <w:tcW w:w="3100" w:type="dxa"/>
-            <w:shd w:val="clear" w:color="auto" w:fill="F7F9FC"/>
-          </w:tcPr>
-          <w:p>
-            <w:pPr>
-              <w:spacing w:before="0" w:after="0"/>
-            </w:pPr>
-            <w:r>
-              <w:rPr>
-                <w:rFonts w:ascii="Consolas" w:hAnsi="Consolas" w:cs="Consolas"/>
-                <w:sz w:val="18"/>
-                <w:szCs w:val="18"/>
-                <w:shd w:val="clear" w:color="auto" w:fill="F2F2F2"/>
-              </w:rPr>
-              <w:t xml:space="preserve">align-items: center</w:t>
-            </w:r>
-          </w:p>
-        </w:tc>
-        <w:tc>
-          <w:tcPr>
-            <w:tcW w:w="5926" w:type="dxa"/>
-          </w:tcPr>
-          <w:p>
-            <w:pPr>
-              <w:spacing w:before="0" w:after="0"/>
-            </w:pPr>
-            <w:r>
-              <w:t xml:space="preserve">Lines up the vertical middle of the logo with the vertical middle of the code box.</w:t>
-            </w:r>
-          </w:p>
-        </w:tc>
-      </w:tr>
-      <w:tr>
-        <w:trPr>
-          <w:cantSplit/>
-        </w:trPr>
-        <w:tc>
-          <w:tcPr>
-            <w:tcW w:w="3100" w:type="dxa"/>
-            <w:shd w:val="clear" w:color="auto" w:fill="F7F9FC"/>
-          </w:tcPr>
-          <w:p>
-            <w:pPr>
-              <w:spacing w:before="0" w:after="0"/>
-            </w:pPr>
-            <w:r>
-              <w:rPr>
-                <w:rFonts w:ascii="Consolas" w:hAnsi="Consolas" w:cs="Consolas"/>
-                <w:sz w:val="18"/>
-                <w:szCs w:val="18"/>
-                <w:shd w:val="clear" w:color="auto" w:fill="F2F2F2"/>
-              </w:rPr>
-              <w:t xml:space="preserve">gap: 30px</w:t>
-            </w:r>
-          </w:p>
-        </w:tc>
-        <w:tc>
-          <w:tcPr>
-            <w:tcW w:w="5926" w:type="dxa"/>
-          </w:tcPr>
-          <w:p>
-            <w:pPr>
-              <w:spacing w:before="0" w:after="0"/>
-            </w:pPr>
-            <w:r>
-              <w:t xml:space="preserve">Puts 30 pixels of space between the logo and the code.</w:t>
-            </w:r>
-          </w:p>
-        </w:tc>
-      </w:tr>
-      <w:tr>
-        <w:trPr>
-          <w:cantSplit/>
-        </w:trPr>
-        <w:tc>
-          <w:tcPr>
-            <w:tcW w:w="3100" w:type="dxa"/>
-            <w:shd w:val="clear" w:color="auto" w:fill="F7F9FC"/>
-          </w:tcPr>
-          <w:p>
-            <w:pPr>
-              <w:spacing w:before="0" w:after="0"/>
-            </w:pPr>
-            <w:r>
-              <w:rPr>
-                <w:rFonts w:ascii="Consolas" w:hAnsi="Consolas" w:cs="Consolas"/>
-                <w:sz w:val="18"/>
-                <w:szCs w:val="18"/>
-                <w:shd w:val="clear" w:color="auto" w:fill="F2F2F2"/>
-              </w:rPr>
-              <w:t xml:space="preserve">&lt;img src="CPP.png" …&gt;</w:t>
-            </w:r>
-          </w:p>
-        </w:tc>
-        <w:tc>
-          <w:tcPr>
-            <w:tcW w:w="5926" w:type="dxa"/>
-          </w:tcPr>
-          <w:p>
-            <w:pPr>
-              <w:spacing w:before="0" w:after="0"/>
-            </w:pPr>
-            <w:r>
-              <w:t xml:space="preserve">Shows the C++ logo. </w:t>
+              <w:t xml:space="preserve">Normally, a picture and a block of code would sit one on top of the other. </w:t>
             </w:r>
             <w:r>
               <w:rPr>
@@ -3101,10 +3379,171 @@
                 <w:szCs w:val="19"/>
                 <w:shd w:val="clear" w:color="auto" w:fill="F2F2F2"/>
               </w:rPr>
-              <w:t xml:space="preserve">src</w:t>
-            </w:r>
-            <w:r>
-              <w:t xml:space="preserve"> is the image file name (the file sits in the same folder as our HTML file).</w:t>
+              <w:t xml:space="preserve">display: flex</w:t>
+            </w:r>
+            <w:r>
+              <w:t xml:space="preserve"> lines up everything inside the box </w:t>
+            </w:r>
+            <w:r>
+              <w:rPr>
+                <w:b/>
+              </w:rPr>
+              <w:t xml:space="preserve">side by side</w:t>
+            </w:r>
+            <w:r>
+              <w:t xml:space="preserve"> in a row, so the logo sits to the left of the code.</w:t>
+            </w:r>
+          </w:p>
+        </w:tc>
+      </w:tr>
+      <w:tr>
+        <w:trPr>
+          <w:cantSplit/>
+        </w:trPr>
+        <w:tc>
+          <w:tcPr>
+            <w:tcW w:w="3100" w:type="dxa"/>
+            <w:shd w:val="clear" w:color="auto" w:fill="F7F9FC"/>
+          </w:tcPr>
+          <w:p>
+            <w:pPr>
+              <w:spacing w:before="0" w:after="0"/>
+            </w:pPr>
+            <w:r>
+              <w:rPr>
+                <w:rFonts w:ascii="Consolas" w:hAnsi="Consolas" w:cs="Consolas"/>
+                <w:sz w:val="18"/>
+                <w:szCs w:val="18"/>
+                <w:shd w:val="clear" w:color="auto" w:fill="F2F2F2"/>
+              </w:rPr>
+              <w:t xml:space="preserve">align-items: center</w:t>
+            </w:r>
+          </w:p>
+        </w:tc>
+        <w:tc>
+          <w:tcPr>
+            <w:tcW w:w="5926" w:type="dxa"/>
+          </w:tcPr>
+          <w:p>
+            <w:pPr>
+              <w:spacing w:before="0" w:after="0"/>
+            </w:pPr>
+            <w:r>
+              <w:t xml:space="preserve">Lines up the logo and the code by their middles, so the logo sits halfway down the code instead of at the top.</w:t>
+            </w:r>
+          </w:p>
+        </w:tc>
+      </w:tr>
+      <w:tr>
+        <w:trPr>
+          <w:cantSplit/>
+        </w:trPr>
+        <w:tc>
+          <w:tcPr>
+            <w:tcW w:w="3100" w:type="dxa"/>
+            <w:shd w:val="clear" w:color="auto" w:fill="F7F9FC"/>
+          </w:tcPr>
+          <w:p>
+            <w:pPr>
+              <w:spacing w:before="0" w:after="0"/>
+            </w:pPr>
+            <w:r>
+              <w:rPr>
+                <w:rFonts w:ascii="Consolas" w:hAnsi="Consolas" w:cs="Consolas"/>
+                <w:sz w:val="18"/>
+                <w:szCs w:val="18"/>
+                <w:shd w:val="clear" w:color="auto" w:fill="F2F2F2"/>
+              </w:rPr>
+              <w:t xml:space="preserve">gap: 30px</w:t>
+            </w:r>
+          </w:p>
+        </w:tc>
+        <w:tc>
+          <w:tcPr>
+            <w:tcW w:w="5926" w:type="dxa"/>
+          </w:tcPr>
+          <w:p>
+            <w:pPr>
+              <w:spacing w:before="0" w:after="0"/>
+            </w:pPr>
+            <w:r>
+              <w:t xml:space="preserve">Puts 30 pixels of empty space between the logo and the code, so they don't touch.</w:t>
+            </w:r>
+          </w:p>
+        </w:tc>
+      </w:tr>
+      <w:tr>
+        <w:trPr>
+          <w:cantSplit/>
+        </w:trPr>
+        <w:tc>
+          <w:tcPr>
+            <w:tcW w:w="3100" w:type="dxa"/>
+            <w:shd w:val="clear" w:color="auto" w:fill="F7F9FC"/>
+          </w:tcPr>
+          <w:p>
+            <w:pPr>
+              <w:spacing w:before="0" w:after="0"/>
+            </w:pPr>
+            <w:r>
+              <w:rPr>
+                <w:rFonts w:ascii="Consolas" w:hAnsi="Consolas" w:cs="Consolas"/>
+                <w:sz w:val="18"/>
+                <w:szCs w:val="18"/>
+                <w:shd w:val="clear" w:color="auto" w:fill="F2F2F2"/>
+              </w:rPr>
+              <w:t xml:space="preserve">&lt;img&gt;</w:t>
+            </w:r>
+          </w:p>
+        </w:tc>
+        <w:tc>
+          <w:tcPr>
+            <w:tcW w:w="5926" w:type="dxa"/>
+          </w:tcPr>
+          <w:p>
+            <w:pPr>
+              <w:spacing w:before="0" w:after="0"/>
+            </w:pPr>
+            <w:r>
+              <w:t xml:space="preserve">Shows a picture. It has no closing tag.</w:t>
+            </w:r>
+          </w:p>
+        </w:tc>
+      </w:tr>
+      <w:tr>
+        <w:trPr>
+          <w:cantSplit/>
+        </w:trPr>
+        <w:tc>
+          <w:tcPr>
+            <w:tcW w:w="3100" w:type="dxa"/>
+            <w:shd w:val="clear" w:color="auto" w:fill="F7F9FC"/>
+          </w:tcPr>
+          <w:p>
+            <w:pPr>
+              <w:spacing w:before="0" w:after="0"/>
+            </w:pPr>
+            <w:r>
+              <w:rPr>
+                <w:rFonts w:ascii="Consolas" w:hAnsi="Consolas" w:cs="Consolas"/>
+                <w:sz w:val="18"/>
+                <w:szCs w:val="18"/>
+                <w:shd w:val="clear" w:color="auto" w:fill="F2F2F2"/>
+              </w:rPr>
+              <w:t xml:space="preserve">src="CPP.png"</w:t>
+            </w:r>
+          </w:p>
+        </w:tc>
+        <w:tc>
+          <w:tcPr>
+            <w:tcW w:w="5926" w:type="dxa"/>
+          </w:tcPr>
+          <w:p>
+            <w:pPr>
+              <w:spacing w:before="0" w:after="0"/>
+            </w:pPr>
+            <w:r>
+              <w:t xml:space="preserve">"src" (source) is the name of the picture file to show. The file sits in the same folder as our HTML file, so we only need its name.</w:t>
             </w:r>
           </w:p>
         </w:tc>
@@ -3142,7 +3581,7 @@
               <w:spacing w:before="0" w:after="0"/>
             </w:pPr>
             <w:r>
-              <w:t xml:space="preserve">Alternative text. It shows if the image can't load, and screen readers read it out for vision-impaired users.</w:t>
+              <w:t xml:space="preserve">Backup text. If the picture can't load, these words show instead. Screen readers also read it out to people who can't see the screen.</w:t>
             </w:r>
           </w:p>
         </w:tc>
@@ -3180,7 +3619,7 @@
               <w:spacing w:before="0" w:after="0"/>
             </w:pPr>
             <w:r>
-              <w:t xml:space="preserve">Makes the logo a 125 × 125 pixel square. We used the same size for every logo so the sections look consistent.</w:t>
+              <w:t xml:space="preserve">Makes the logo a 125 × 125 pixel square. We used the same size for every logo so all the sections match.</w:t>
             </w:r>
           </w:p>
         </w:tc>
@@ -3218,7 +3657,16 @@
               <w:spacing w:before="0" w:after="0"/>
             </w:pPr>
             <w:r>
-              <w:t xml:space="preserve">Pushes the logo 20 pixels away from the left edge of the page.</w:t>
+              <w:t xml:space="preserve">A margin is empty space </w:t>
+            </w:r>
+            <w:r>
+              <w:rPr>
+                <w:b/>
+              </w:rPr>
+              <w:t xml:space="preserve">outside</w:t>
+            </w:r>
+            <w:r>
+              <w:t xml:space="preserve"> an element. This adds 20 pixels of space to the left of the logo, so it isn't stuck to the edge of the page.</w:t>
             </w:r>
           </w:p>
         </w:tc>
@@ -3256,7 +3704,7 @@
               <w:spacing w:before="0" w:after="0"/>
             </w:pPr>
             <w:r>
-              <w:t xml:space="preserve">Preformatted text. Normally HTML squashes extra spaces and ignores line breaks. </w:t>
+              <w:t xml:space="preserve">Normally, HTML squashes extra spaces into one and ignores the Enter key. Code needs its spaces and line breaks, so </w:t>
             </w:r>
             <w:r>
               <w:rPr>
@@ -3268,7 +3716,16 @@
               <w:t xml:space="preserve">&lt;pre&gt;</w:t>
             </w:r>
             <w:r>
-              <w:t xml:space="preserve"> keeps them exactly as typed and uses a fixed-width font, which code needs.</w:t>
+              <w:t xml:space="preserve"> ("preformatted") shows the text </w:t>
+            </w:r>
+            <w:r>
+              <w:rPr>
+                <w:b/>
+              </w:rPr>
+              <w:t xml:space="preserve">exactly as typed</w:t>
+            </w:r>
+            <w:r>
+              <w:t xml:space="preserve">, in a font where every letter is the same width.</w:t>
             </w:r>
           </w:p>
         </w:tc>
@@ -3306,45 +3763,45 @@
               <w:spacing w:before="0" w:after="0"/>
             </w:pPr>
             <w:r>
-              <w:t xml:space="preserve">Marks the text as computer code.</w:t>
-            </w:r>
-          </w:p>
-        </w:tc>
-      </w:tr>
-      <w:tr>
-        <w:trPr>
-          <w:cantSplit/>
-        </w:trPr>
-        <w:tc>
-          <w:tcPr>
-            <w:tcW w:w="3100" w:type="dxa"/>
-            <w:shd w:val="clear" w:color="auto" w:fill="F7F9FC"/>
-          </w:tcPr>
-          <w:p>
-            <w:pPr>
-              <w:spacing w:before="0" w:after="0"/>
-            </w:pPr>
-            <w:r>
-              <w:rPr>
-                <w:rFonts w:ascii="Consolas" w:hAnsi="Consolas" w:cs="Consolas"/>
-                <w:sz w:val="18"/>
-                <w:szCs w:val="18"/>
-                <w:shd w:val="clear" w:color="auto" w:fill="F2F2F2"/>
-              </w:rPr>
-              <w:t xml:space="preserve">&amp;lt;  and  &amp;gt;</w:t>
-            </w:r>
-          </w:p>
-        </w:tc>
-        <w:tc>
-          <w:tcPr>
-            <w:tcW w:w="5926" w:type="dxa"/>
-          </w:tcPr>
-          <w:p>
-            <w:pPr>
-              <w:spacing w:before="0" w:after="0"/>
-            </w:pPr>
-            <w:r>
-              <w:t xml:space="preserve">HTML entities for the </w:t>
+              <w:t xml:space="preserve">Labels the text inside as computer code.</w:t>
+            </w:r>
+          </w:p>
+        </w:tc>
+      </w:tr>
+      <w:tr>
+        <w:trPr>
+          <w:cantSplit/>
+        </w:trPr>
+        <w:tc>
+          <w:tcPr>
+            <w:tcW w:w="3100" w:type="dxa"/>
+            <w:shd w:val="clear" w:color="auto" w:fill="F7F9FC"/>
+          </w:tcPr>
+          <w:p>
+            <w:pPr>
+              <w:spacing w:before="0" w:after="0"/>
+            </w:pPr>
+            <w:r>
+              <w:rPr>
+                <w:rFonts w:ascii="Consolas" w:hAnsi="Consolas" w:cs="Consolas"/>
+                <w:sz w:val="18"/>
+                <w:szCs w:val="18"/>
+                <w:shd w:val="clear" w:color="auto" w:fill="F2F2F2"/>
+              </w:rPr>
+              <w:t xml:space="preserve">&amp;lt; and &amp;gt;</w:t>
+            </w:r>
+          </w:p>
+        </w:tc>
+        <w:tc>
+          <w:tcPr>
+            <w:tcW w:w="5926" w:type="dxa"/>
+          </w:tcPr>
+          <w:p>
+            <w:pPr>
+              <w:spacing w:before="0" w:after="0"/>
+            </w:pPr>
+            <w:r>
+              <w:t xml:space="preserve">Special codes for the </w:t>
             </w:r>
             <w:r>
               <w:rPr>
@@ -3368,7 +3825,7 @@
               <w:t xml:space="preserve">&gt;</w:t>
             </w:r>
             <w:r>
-              <w:t xml:space="preserve"> symbols. Without them, the browser would treat </w:t>
+              <w:t xml:space="preserve"> symbols ("lt" = less than, "gt" = greater than). Browsers treat anything inside </w:t>
             </w:r>
             <w:r>
               <w:rPr>
@@ -3377,10 +3834,10 @@
                 <w:szCs w:val="19"/>
                 <w:shd w:val="clear" w:color="auto" w:fill="F2F2F2"/>
               </w:rPr>
-              <w:t xml:space="preserve">&lt;iostream&gt;</w:t>
-            </w:r>
-            <w:r>
-              <w:t xml:space="preserve"> as an HTML tag and hide it. </w:t>
+              <w:t xml:space="preserve">&lt; &gt;</w:t>
+            </w:r>
+            <w:r>
+              <w:t xml:space="preserve"> as a tag and hide it. If we typed </w:t>
             </w:r>
             <w:r>
               <w:rPr>
@@ -3389,10 +3846,10 @@
                 <w:szCs w:val="19"/>
                 <w:shd w:val="clear" w:color="auto" w:fill="F2F2F2"/>
               </w:rPr>
-              <w:t xml:space="preserve">#include &amp;lt;iostream&amp;gt;</w:t>
-            </w:r>
-            <w:r>
-              <w:t xml:space="preserve"> displays as </w:t>
+              <w:t xml:space="preserve">&lt;iostream&gt;</w:t>
+            </w:r>
+            <w:r>
+              <w:t xml:space="preserve"> directly, it would disappear from the page. Writing </w:t>
             </w:r>
             <w:r>
               <w:rPr>
@@ -3401,48 +3858,19 @@
                 <w:szCs w:val="19"/>
                 <w:shd w:val="clear" w:color="auto" w:fill="F2F2F2"/>
               </w:rPr>
-              <w:t xml:space="preserve">#include &lt;iostream&gt;</w:t>
-            </w:r>
-            <w:r>
-              <w:t xml:space="preserve">.</w:t>
-            </w:r>
-          </w:p>
-        </w:tc>
-      </w:tr>
-      <w:tr>
-        <w:trPr>
-          <w:cantSplit/>
-        </w:trPr>
-        <w:tc>
-          <w:tcPr>
-            <w:tcW w:w="3100" w:type="dxa"/>
-            <w:shd w:val="clear" w:color="auto" w:fill="F7F9FC"/>
-          </w:tcPr>
-          <w:p>
-            <w:pPr>
-              <w:spacing w:before="0" w:after="0"/>
-            </w:pPr>
-            <w:r>
-              <w:rPr>
-                <w:rFonts w:ascii="Consolas" w:hAnsi="Consolas" w:cs="Consolas"/>
-                <w:sz w:val="18"/>
-                <w:szCs w:val="18"/>
-                <w:shd w:val="clear" w:color="auto" w:fill="F2F2F2"/>
-              </w:rPr>
-              <w:t xml:space="preserve">&lt;&amp;lt;</w:t>
-            </w:r>
-          </w:p>
-        </w:tc>
-        <w:tc>
-          <w:tcPr>
-            <w:tcW w:w="5926" w:type="dxa"/>
-          </w:tcPr>
-          <w:p>
-            <w:pPr>
-              <w:spacing w:before="0" w:after="0"/>
-            </w:pPr>
-            <w:r>
-              <w:t xml:space="preserve">Displays as </w:t>
+              <w:t xml:space="preserve">&amp;lt;iostream&amp;gt;</w:t>
+            </w:r>
+            <w:r>
+              <w:t xml:space="preserve"> makes it </w:t>
+            </w:r>
+            <w:r>
+              <w:rPr>
+                <w:b/>
+              </w:rPr>
+              <w:t xml:space="preserve">show</w:t>
+            </w:r>
+            <w:r>
+              <w:t xml:space="preserve"> as </w:t>
             </w:r>
             <w:r>
               <w:rPr>
@@ -3451,10 +3879,48 @@
                 <w:szCs w:val="19"/>
                 <w:shd w:val="clear" w:color="auto" w:fill="F2F2F2"/>
               </w:rPr>
-              <w:t xml:space="preserve">&lt;&lt;</w:t>
-            </w:r>
-            <w:r>
-              <w:t xml:space="preserve">. The first </w:t>
+              <w:t xml:space="preserve">&lt;iostream&gt;</w:t>
+            </w:r>
+            <w:r>
+              <w:t xml:space="preserve">.</w:t>
+            </w:r>
+          </w:p>
+        </w:tc>
+      </w:tr>
+      <w:tr>
+        <w:trPr>
+          <w:cantSplit/>
+        </w:trPr>
+        <w:tc>
+          <w:tcPr>
+            <w:tcW w:w="3100" w:type="dxa"/>
+            <w:shd w:val="clear" w:color="auto" w:fill="F7F9FC"/>
+          </w:tcPr>
+          <w:p>
+            <w:pPr>
+              <w:spacing w:before="0" w:after="0"/>
+            </w:pPr>
+            <w:r>
+              <w:rPr>
+                <w:rFonts w:ascii="Consolas" w:hAnsi="Consolas" w:cs="Consolas"/>
+                <w:sz w:val="18"/>
+                <w:szCs w:val="18"/>
+                <w:shd w:val="clear" w:color="auto" w:fill="F2F2F2"/>
+              </w:rPr>
+              <w:t xml:space="preserve">&lt;&amp;lt;</w:t>
+            </w:r>
+          </w:p>
+        </w:tc>
+        <w:tc>
+          <w:tcPr>
+            <w:tcW w:w="5926" w:type="dxa"/>
+          </w:tcPr>
+          <w:p>
+            <w:pPr>
+              <w:spacing w:before="0" w:after="0"/>
+            </w:pPr>
+            <w:r>
+              <w:t xml:space="preserve">Shows on the page as </w:t>
             </w:r>
             <w:r>
               <w:rPr>
@@ -3463,10 +3929,22 @@
                 <w:szCs w:val="19"/>
                 <w:shd w:val="clear" w:color="auto" w:fill="F2F2F2"/>
               </w:rPr>
+              <w:t xml:space="preserve">&lt;&lt;</w:t>
+            </w:r>
+            <w:r>
+              <w:t xml:space="preserve">. The first </w:t>
+            </w:r>
+            <w:r>
+              <w:rPr>
+                <w:rFonts w:ascii="Consolas" w:hAnsi="Consolas" w:cs="Consolas"/>
+                <w:sz w:val="19"/>
+                <w:szCs w:val="19"/>
+                <w:shd w:val="clear" w:color="auto" w:fill="F2F2F2"/>
+              </w:rPr>
               <w:t xml:space="preserve">&lt;</w:t>
             </w:r>
             <w:r>
-              <w:t xml:space="preserve"> is typed directly. The browser shows it as plain text because it isn't followed by a tag name.</w:t>
+              <w:t xml:space="preserve"> can be typed normally because it isn't followed by a tag name, so the browser shows it as plain text.</w:t>
             </w:r>
           </w:p>
         </w:tc>
@@ -3490,7 +3968,7 @@
         <w:rPr>
           <w:b/>
         </w:rPr>
-        <w:t xml:space="preserve">What the C++ program does:</w:t>
+        <w:t xml:space="preserve">What the C++ program itself does:</w:t>
       </w:r>
       <w:r>
         <w:t xml:space="preserve"> </w:t>
@@ -3505,7 +3983,7 @@
         <w:t xml:space="preserve">#include &lt;iostream&gt;</w:t>
       </w:r>
       <w:r>
-        <w:t xml:space="preserve"> loads the input/output library. </w:t>
+        <w:t xml:space="preserve"> loads the tools needed to show text on the screen. </w:t>
       </w:r>
       <w:r>
         <w:rPr>
@@ -3517,7 +3995,7 @@
         <w:t xml:space="preserve">main()</w:t>
       </w:r>
       <w:r>
-        <w:t xml:space="preserve"> is where the program starts. </w:t>
+        <w:t xml:space="preserve"> is where the program starts running. </w:t>
       </w:r>
       <w:r>
         <w:rPr>
@@ -3529,7 +4007,19 @@
         <w:t xml:space="preserve">cout &lt;&lt; "Hello World!" &lt;&lt; endl;</w:t>
       </w:r>
       <w:r>
-        <w:t xml:space="preserve"> prints Hello World! and then moves to a new line.</w:t>
+        <w:t xml:space="preserve"> shows "Hello World!" on the screen, and </w:t>
+      </w:r>
+      <w:r>
+        <w:rPr>
+          <w:rFonts w:ascii="Consolas" w:hAnsi="Consolas" w:cs="Consolas"/>
+          <w:sz w:val="19"/>
+          <w:szCs w:val="19"/>
+          <w:shd w:val="clear" w:color="auto" w:fill="F2F2F2"/>
+        </w:rPr>
+        <w:t xml:space="preserve">endl</w:t>
+      </w:r>
+      <w:r>
+        <w:t xml:space="preserve"> moves to the next line (like pressing Enter).</w:t>
       </w:r>
     </w:p>
     <w:p>
@@ -3545,7 +4035,7 @@
         <w:rPr>
           <w:b/>
         </w:rPr>
-        <w:t xml:space="preserve">Why lines 49–52 start at the very left edge:</w:t>
+        <w:t xml:space="preserve">Why lines 49–52 start right at the left edge:</w:t>
       </w:r>
       <w:r>
         <w:t xml:space="preserve"> </w:t>
@@ -3560,7 +4050,7 @@
         <w:t xml:space="preserve">&lt;pre&gt;</w:t>
       </w:r>
       <w:r>
-        <w:t xml:space="preserve"> keeps every space exactly as typed. If we had indented those lines in our HTML file, the code on the page would be indented too.</w:t>
+        <w:t xml:space="preserve"> keeps every space exactly as typed. If we had indented these lines in our HTML file like the rest of our code, that extra space would also show up on the page.</w:t>
       </w:r>
     </w:p>
     <w:p>
@@ -3630,19 +4120,7 @@
     </w:p>
     <w:p>
       <w:r>
-        <w:t xml:space="preserve">This section uses the same layout as C++: an </w:t>
-      </w:r>
-      <w:r>
-        <w:rPr>
-          <w:rFonts w:ascii="Consolas" w:hAnsi="Consolas" w:cs="Consolas"/>
-          <w:sz w:val="19"/>
-          <w:szCs w:val="19"/>
-          <w:shd w:val="clear" w:color="auto" w:fill="F2F2F2"/>
-        </w:rPr>
-        <w:t xml:space="preserve">&lt;h3&gt;</w:t>
-      </w:r>
-      <w:r>
-        <w:t xml:space="preserve"> with </w:t>
+        <w:t xml:space="preserve">This section is built exactly like the C++ one: a heading with </w:t>
       </w:r>
       <w:r>
         <w:rPr>
@@ -3654,19 +4132,7 @@
         <w:t xml:space="preserve">id="csharp"</w:t>
       </w:r>
       <w:r>
-        <w:t xml:space="preserve">, a flexbox </w:t>
-      </w:r>
-      <w:r>
-        <w:rPr>
-          <w:rFonts w:ascii="Consolas" w:hAnsi="Consolas" w:cs="Consolas"/>
-          <w:sz w:val="19"/>
-          <w:szCs w:val="19"/>
-          <w:shd w:val="clear" w:color="auto" w:fill="F2F2F2"/>
-        </w:rPr>
-        <w:t xml:space="preserve">&lt;div&gt;</w:t>
-      </w:r>
-      <w:r>
-        <w:t xml:space="preserve"> with a 30px gap, the logo (</w:t>
+        <w:t xml:space="preserve"> (so the link at the top can find it), a flex box that puts the logo (</w:t>
       </w:r>
       <w:r>
         <w:rPr>
@@ -3678,7 +4144,7 @@
         <w:t xml:space="preserve">CS.png</w:t>
       </w:r>
       <w:r>
-        <w:t xml:space="preserve">), and the code inside </w:t>
+        <w:t xml:space="preserve">) and the code side by side with a 30px gap, and the code inside </w:t>
       </w:r>
       <w:r>
         <w:rPr>
@@ -3690,7 +4156,7 @@
         <w:t xml:space="preserve">&lt;pre&gt;&lt;code&gt;</w:t>
       </w:r>
       <w:r>
-        <w:t xml:space="preserve">. The C# code has no </w:t>
+        <w:t xml:space="preserve">. The C# code doesn't use any </w:t>
       </w:r>
       <w:r>
         <w:rPr>
@@ -3714,7 +4180,31 @@
         <w:t xml:space="preserve">&gt;</w:t>
       </w:r>
       <w:r>
-        <w:t xml:space="preserve"> symbols, so we didn't need any HTML entities here.</w:t>
+        <w:t xml:space="preserve"> symbols, so we didn't need the special </w:t>
+      </w:r>
+      <w:r>
+        <w:rPr>
+          <w:rFonts w:ascii="Consolas" w:hAnsi="Consolas" w:cs="Consolas"/>
+          <w:sz w:val="19"/>
+          <w:szCs w:val="19"/>
+          <w:shd w:val="clear" w:color="auto" w:fill="F2F2F2"/>
+        </w:rPr>
+        <w:t xml:space="preserve">&amp;lt;</w:t>
+      </w:r>
+      <w:r>
+        <w:t xml:space="preserve"> and </w:t>
+      </w:r>
+      <w:r>
+        <w:rPr>
+          <w:rFonts w:ascii="Consolas" w:hAnsi="Consolas" w:cs="Consolas"/>
+          <w:sz w:val="19"/>
+          <w:szCs w:val="19"/>
+          <w:shd w:val="clear" w:color="auto" w:fill="F2F2F2"/>
+        </w:rPr>
+        <w:t xml:space="preserve">&amp;gt;</w:t>
+      </w:r>
+      <w:r>
+        <w:t xml:space="preserve"> codes here.</w:t>
       </w:r>
     </w:p>
     <w:tbl>
@@ -3776,7 +4266,7 @@
               <w:rPr>
                 <w:b/>
               </w:rPr>
-              <w:t xml:space="preserve">What it does</w:t>
+              <w:t xml:space="preserve">What it means</w:t>
             </w:r>
           </w:p>
         </w:tc>
@@ -3814,7 +4304,7 @@
               <w:spacing w:before="0" w:after="0"/>
             </w:pPr>
             <w:r>
-              <w:t xml:space="preserve">Lets the program use built-in tools from the System library, like </w:t>
+              <w:t xml:space="preserve">Lets the program use C#'s built-in tools, such as </w:t>
             </w:r>
             <w:r>
               <w:rPr>
@@ -3826,7 +4316,7 @@
               <w:t xml:space="preserve">Console</w:t>
             </w:r>
             <w:r>
-              <w:t xml:space="preserve">.</w:t>
+              <w:t xml:space="preserve">, which shows text on the screen.</w:t>
             </w:r>
           </w:p>
         </w:tc>
@@ -3864,7 +4354,7 @@
               <w:spacing w:before="0" w:after="0"/>
             </w:pPr>
             <w:r>
-              <w:t xml:space="preserve">In C#, all code has to sit inside a class. </w:t>
+              <w:t xml:space="preserve">In C#, all code has to go inside a "class", which is like a folder for code. </w:t>
             </w:r>
             <w:r>
               <w:rPr>
@@ -3876,7 +4366,7 @@
               <w:t xml:space="preserve">Program</w:t>
             </w:r>
             <w:r>
-              <w:t xml:space="preserve"> is the class name.</w:t>
+              <w:t xml:space="preserve"> is the name we gave it.</w:t>
             </w:r>
           </w:p>
         </w:tc>
@@ -3914,83 +4404,7 @@
               <w:spacing w:before="0" w:after="0"/>
             </w:pPr>
             <w:r>
-              <w:t xml:space="preserve">The starting point of the program. This code runs first.</w:t>
-            </w:r>
-          </w:p>
-        </w:tc>
-      </w:tr>
-      <w:tr>
-        <w:trPr>
-          <w:cantSplit/>
-        </w:trPr>
-        <w:tc>
-          <w:tcPr>
-            <w:tcW w:w="3100" w:type="dxa"/>
-            <w:shd w:val="clear" w:color="auto" w:fill="F7F9FC"/>
-          </w:tcPr>
-          <w:p>
-            <w:pPr>
-              <w:spacing w:before="0" w:after="0"/>
-            </w:pPr>
-            <w:r>
-              <w:rPr>
-                <w:rFonts w:ascii="Consolas" w:hAnsi="Consolas" w:cs="Consolas"/>
-                <w:sz w:val="18"/>
-                <w:szCs w:val="18"/>
-                <w:shd w:val="clear" w:color="auto" w:fill="F2F2F2"/>
-              </w:rPr>
-              <w:t xml:space="preserve">Console.WriteLine("Hello, World!");</w:t>
-            </w:r>
-          </w:p>
-        </w:tc>
-        <w:tc>
-          <w:tcPr>
-            <w:tcW w:w="5926" w:type="dxa"/>
-          </w:tcPr>
-          <w:p>
-            <w:pPr>
-              <w:spacing w:before="0" w:after="0"/>
-            </w:pPr>
-            <w:r>
-              <w:t xml:space="preserve">Prints Hello, World! to the screen and moves to a new line.</w:t>
-            </w:r>
-          </w:p>
-        </w:tc>
-      </w:tr>
-      <w:tr>
-        <w:trPr>
-          <w:cantSplit/>
-        </w:trPr>
-        <w:tc>
-          <w:tcPr>
-            <w:tcW w:w="3100" w:type="dxa"/>
-            <w:shd w:val="clear" w:color="auto" w:fill="F7F9FC"/>
-          </w:tcPr>
-          <w:p>
-            <w:pPr>
-              <w:spacing w:before="0" w:after="0"/>
-            </w:pPr>
-            <w:r>
-              <w:rPr>
-                <w:rFonts w:ascii="Consolas" w:hAnsi="Consolas" w:cs="Consolas"/>
-                <w:sz w:val="18"/>
-                <w:szCs w:val="18"/>
-                <w:shd w:val="clear" w:color="auto" w:fill="F2F2F2"/>
-              </w:rPr>
-              <w:t xml:space="preserve">Indentation</w:t>
-            </w:r>
-          </w:p>
-        </w:tc>
-        <w:tc>
-          <w:tcPr>
-            <w:tcW w:w="5926" w:type="dxa"/>
-          </w:tcPr>
-          <w:p>
-            <w:pPr>
-              <w:spacing w:before="0" w:after="0"/>
-            </w:pPr>
-            <w:r>
-              <w:t xml:space="preserve">Because we used </w:t>
+              <w:t xml:space="preserve">The starting point. When the program runs, the code inside </w:t>
             </w:r>
             <w:r>
               <w:rPr>
@@ -3999,10 +4413,136 @@
                 <w:szCs w:val="19"/>
                 <w:shd w:val="clear" w:color="auto" w:fill="F2F2F2"/>
               </w:rPr>
+              <w:t xml:space="preserve">Main</w:t>
+            </w:r>
+            <w:r>
+              <w:t xml:space="preserve"> runs first.</w:t>
+            </w:r>
+          </w:p>
+        </w:tc>
+      </w:tr>
+      <w:tr>
+        <w:trPr>
+          <w:cantSplit/>
+        </w:trPr>
+        <w:tc>
+          <w:tcPr>
+            <w:tcW w:w="3100" w:type="dxa"/>
+            <w:shd w:val="clear" w:color="auto" w:fill="F7F9FC"/>
+          </w:tcPr>
+          <w:p>
+            <w:pPr>
+              <w:spacing w:before="0" w:after="0"/>
+            </w:pPr>
+            <w:r>
+              <w:rPr>
+                <w:rFonts w:ascii="Consolas" w:hAnsi="Consolas" w:cs="Consolas"/>
+                <w:sz w:val="18"/>
+                <w:szCs w:val="18"/>
+                <w:shd w:val="clear" w:color="auto" w:fill="F2F2F2"/>
+              </w:rPr>
+              <w:t xml:space="preserve">Console.WriteLine("Hello, World!");</w:t>
+            </w:r>
+          </w:p>
+        </w:tc>
+        <w:tc>
+          <w:tcPr>
+            <w:tcW w:w="5926" w:type="dxa"/>
+          </w:tcPr>
+          <w:p>
+            <w:pPr>
+              <w:spacing w:before="0" w:after="0"/>
+            </w:pPr>
+            <w:r>
+              <w:t xml:space="preserve">Shows "Hello, World!" on the screen, then moves to a new line.</w:t>
+            </w:r>
+          </w:p>
+        </w:tc>
+      </w:tr>
+      <w:tr>
+        <w:trPr>
+          <w:cantSplit/>
+        </w:trPr>
+        <w:tc>
+          <w:tcPr>
+            <w:tcW w:w="3100" w:type="dxa"/>
+            <w:shd w:val="clear" w:color="auto" w:fill="F7F9FC"/>
+          </w:tcPr>
+          <w:p>
+            <w:pPr>
+              <w:spacing w:before="0" w:after="0"/>
+            </w:pPr>
+            <w:r>
+              <w:rPr>
+                <w:rFonts w:ascii="Consolas" w:hAnsi="Consolas" w:cs="Consolas"/>
+                <w:sz w:val="18"/>
+                <w:szCs w:val="18"/>
+                <w:shd w:val="clear" w:color="auto" w:fill="F2F2F2"/>
+              </w:rPr>
+              <w:t xml:space="preserve">{ and }</w:t>
+            </w:r>
+          </w:p>
+        </w:tc>
+        <w:tc>
+          <w:tcPr>
+            <w:tcW w:w="5926" w:type="dxa"/>
+          </w:tcPr>
+          <w:p>
+            <w:pPr>
+              <w:spacing w:before="0" w:after="0"/>
+            </w:pPr>
+            <w:r>
+              <w:t xml:space="preserve">Curly brackets mark where a block of code starts and ends, a bit like opening and closing tags in HTML.</w:t>
+            </w:r>
+          </w:p>
+        </w:tc>
+      </w:tr>
+      <w:tr>
+        <w:trPr>
+          <w:cantSplit/>
+        </w:trPr>
+        <w:tc>
+          <w:tcPr>
+            <w:tcW w:w="3100" w:type="dxa"/>
+            <w:shd w:val="clear" w:color="auto" w:fill="F7F9FC"/>
+          </w:tcPr>
+          <w:p>
+            <w:pPr>
+              <w:spacing w:before="0" w:after="0"/>
+            </w:pPr>
+            <w:r>
+              <w:rPr>
+                <w:rFonts w:ascii="Consolas" w:hAnsi="Consolas" w:cs="Consolas"/>
+                <w:sz w:val="18"/>
+                <w:szCs w:val="18"/>
+                <w:shd w:val="clear" w:color="auto" w:fill="F2F2F2"/>
+              </w:rPr>
+              <w:t xml:space="preserve">Indentation</w:t>
+            </w:r>
+          </w:p>
+        </w:tc>
+        <w:tc>
+          <w:tcPr>
+            <w:tcW w:w="5926" w:type="dxa"/>
+          </w:tcPr>
+          <w:p>
+            <w:pPr>
+              <w:spacing w:before="0" w:after="0"/>
+            </w:pPr>
+            <w:r>
+              <w:t xml:space="preserve">The spaces at the start of each line make the code easier to read. Because we used </w:t>
+            </w:r>
+            <w:r>
+              <w:rPr>
+                <w:rFonts w:ascii="Consolas" w:hAnsi="Consolas" w:cs="Consolas"/>
+                <w:sz w:val="19"/>
+                <w:szCs w:val="19"/>
+                <w:shd w:val="clear" w:color="auto" w:fill="F2F2F2"/>
+              </w:rPr>
               <w:t xml:space="preserve">&lt;pre&gt;</w:t>
             </w:r>
             <w:r>
-              <w:t xml:space="preserve">, the spaces before each line are kept, so the curly brackets and code still line up neatly on the page.</w:t>
+              <w:t xml:space="preserve">, these spaces are kept, so the code lines up neatly on the page too.</w:t>
             </w:r>
           </w:p>
         </w:tc>
@@ -4137,7 +4677,7 @@
               <w:rPr>
                 <w:b/>
               </w:rPr>
-              <w:t xml:space="preserve">What it does</w:t>
+              <w:t xml:space="preserve">What it means</w:t>
             </w:r>
           </w:p>
         </w:tc>
@@ -4175,7 +4715,7 @@
               <w:spacing w:before="0" w:after="0"/>
             </w:pPr>
             <w:r>
-              <w:t xml:space="preserve">Our comments explaining how the flexbox layout works. The browser doesn't show them.</w:t>
+              <w:t xml:space="preserve">Comments where we wrote notes explaining how the flex box layout works. The browser ignores them.</w:t>
             </w:r>
           </w:p>
         </w:tc>
@@ -4213,7 +4753,7 @@
               <w:spacing w:before="0" w:after="0"/>
             </w:pPr>
             <w:r>
-              <w:t xml:space="preserve">A smaller gap (8px) than the other sections (30px). The Python code lines already start with 4 spaces (lines 83–85), which adds some space on their own.</w:t>
+              <w:t xml:space="preserve">A smaller gap (8 pixels) than the other sections (30 pixels). The Python code lines already start with some spaces (lines 83–85), which adds extra room, so a big gap wasn't needed.</w:t>
             </w:r>
           </w:p>
         </w:tc>
@@ -4263,7 +4803,7 @@
               <w:t xml:space="preserve">.jpg</w:t>
             </w:r>
             <w:r>
-              <w:t xml:space="preserve"> file instead of </w:t>
+              <w:t xml:space="preserve"> file, while the others are </w:t>
             </w:r>
             <w:r>
               <w:rPr>
@@ -4275,7 +4815,7 @@
               <w:t xml:space="preserve">.png</w:t>
             </w:r>
             <w:r>
-              <w:t xml:space="preserve">. The </w:t>
+              <w:t xml:space="preserve"> files. Both are common picture types, and </w:t>
             </w:r>
             <w:r>
               <w:rPr>
@@ -4287,7 +4827,7 @@
               <w:t xml:space="preserve">&lt;img&gt;</w:t>
             </w:r>
             <w:r>
-              <w:t xml:space="preserve"> tag works with both.</w:t>
+              <w:t xml:space="preserve"> can show either one.</w:t>
             </w:r>
           </w:p>
         </w:tc>
@@ -4325,7 +4865,7 @@
               <w:spacing w:before="0" w:after="0"/>
             </w:pPr>
             <w:r>
-              <w:t xml:space="preserve">The code begins on the line </w:t>
+              <w:t xml:space="preserve">Here the code starts on the line </w:t>
             </w:r>
             <w:r>
               <w:rPr>
@@ -4346,7 +4886,7 @@
               <w:t xml:space="preserve">&lt;code&gt;</w:t>
             </w:r>
             <w:r>
-              <w:t xml:space="preserve">, and the closing tag is on its own line too. Because </w:t>
+              <w:t xml:space="preserve">, and the closing tags are on their own line too. Because </w:t>
             </w:r>
             <w:r>
               <w:rPr>
@@ -4358,7 +4898,7 @@
               <w:t xml:space="preserve">&lt;pre&gt;</w:t>
             </w:r>
             <w:r>
-              <w:t xml:space="preserve"> keeps line breaks, this adds an empty line above and below the code.</w:t>
+              <w:t xml:space="preserve"> keeps every line break, this adds an empty line above and below the code.</w:t>
             </w:r>
           </w:p>
         </w:tc>
@@ -4408,45 +4948,7 @@
               <w:t xml:space="preserve">#</w:t>
             </w:r>
             <w:r>
-              <w:t xml:space="preserve"> is a comment. Python ignores it when the program runs.</w:t>
-            </w:r>
-          </w:p>
-        </w:tc>
-      </w:tr>
-      <w:tr>
-        <w:trPr>
-          <w:cantSplit/>
-        </w:trPr>
-        <w:tc>
-          <w:tcPr>
-            <w:tcW w:w="3100" w:type="dxa"/>
-            <w:shd w:val="clear" w:color="auto" w:fill="F7F9FC"/>
-          </w:tcPr>
-          <w:p>
-            <w:pPr>
-              <w:spacing w:before="0" w:after="0"/>
-            </w:pPr>
-            <w:r>
-              <w:rPr>
-                <w:rFonts w:ascii="Consolas" w:hAnsi="Consolas" w:cs="Consolas"/>
-                <w:sz w:val="18"/>
-                <w:szCs w:val="18"/>
-                <w:shd w:val="clear" w:color="auto" w:fill="F2F2F2"/>
-              </w:rPr>
-              <w:t xml:space="preserve">print("Hello, World!")</w:t>
-            </w:r>
-          </w:p>
-        </w:tc>
-        <w:tc>
-          <w:tcPr>
-            <w:tcW w:w="5926" w:type="dxa"/>
-          </w:tcPr>
-          <w:p>
-            <w:pPr>
-              <w:spacing w:before="0" w:after="0"/>
-            </w:pPr>
-            <w:r>
-              <w:t xml:space="preserve">Python's built-in </w:t>
+              <w:t xml:space="preserve"> is a comment: a note for people reading the code. Python skips it when the program runs (just like </w:t>
             </w:r>
             <w:r>
               <w:rPr>
@@ -4455,10 +4957,57 @@
                 <w:szCs w:val="19"/>
                 <w:shd w:val="clear" w:color="auto" w:fill="F2F2F2"/>
               </w:rPr>
+              <w:t xml:space="preserve">&lt;!-- --&gt;</w:t>
+            </w:r>
+            <w:r>
+              <w:t xml:space="preserve"> in HTML).</w:t>
+            </w:r>
+          </w:p>
+        </w:tc>
+      </w:tr>
+      <w:tr>
+        <w:trPr>
+          <w:cantSplit/>
+        </w:trPr>
+        <w:tc>
+          <w:tcPr>
+            <w:tcW w:w="3100" w:type="dxa"/>
+            <w:shd w:val="clear" w:color="auto" w:fill="F7F9FC"/>
+          </w:tcPr>
+          <w:p>
+            <w:pPr>
+              <w:spacing w:before="0" w:after="0"/>
+            </w:pPr>
+            <w:r>
+              <w:rPr>
+                <w:rFonts w:ascii="Consolas" w:hAnsi="Consolas" w:cs="Consolas"/>
+                <w:sz w:val="18"/>
+                <w:szCs w:val="18"/>
+                <w:shd w:val="clear" w:color="auto" w:fill="F2F2F2"/>
+              </w:rPr>
+              <w:t xml:space="preserve">print("Hello, World!")</w:t>
+            </w:r>
+          </w:p>
+        </w:tc>
+        <w:tc>
+          <w:tcPr>
+            <w:tcW w:w="5926" w:type="dxa"/>
+          </w:tcPr>
+          <w:p>
+            <w:pPr>
+              <w:spacing w:before="0" w:after="0"/>
+            </w:pPr>
+            <w:r>
+              <w:rPr>
+                <w:rFonts w:ascii="Consolas" w:hAnsi="Consolas" w:cs="Consolas"/>
+                <w:sz w:val="19"/>
+                <w:szCs w:val="19"/>
+                <w:shd w:val="clear" w:color="auto" w:fill="F2F2F2"/>
+              </w:rPr>
               <w:t xml:space="preserve">print</w:t>
             </w:r>
             <w:r>
-              <w:t xml:space="preserve"> function. It displays Hello, World! on the screen.</w:t>
+              <w:t xml:space="preserve"> is Python's built-in command for showing text. This line shows "Hello, World!" on the screen. Python is famous for being short and simple, and this whole program is just one line.</w:t>
             </w:r>
           </w:p>
         </w:tc>
@@ -4536,7 +5085,16 @@
     </w:p>
     <w:p>
       <w:r>
-        <w:t xml:space="preserve">This section was the trickiest because the code we want to display is HTML itself. If we typed </w:t>
+        <w:t xml:space="preserve">This section was the trickiest, because the code we want to </w:t>
+      </w:r>
+      <w:r>
+        <w:rPr>
+          <w:b/>
+        </w:rPr>
+        <w:t xml:space="preserve">show</w:t>
+      </w:r>
+      <w:r>
+        <w:t xml:space="preserve"> is HTML, the same language our page is written in. If we typed </w:t>
       </w:r>
       <w:r>
         <w:rPr>
@@ -4548,25 +5106,7 @@
         <w:t xml:space="preserve">&lt;p&gt;Hello World!&lt;/p&gt;</w:t>
       </w:r>
       <w:r>
-        <w:t xml:space="preserve"> directly, the browser would </w:t>
-      </w:r>
-      <w:r>
-        <w:rPr>
-          <w:b/>
-        </w:rPr>
-        <w:t xml:space="preserve">create</w:t>
-      </w:r>
-      <w:r>
-        <w:t xml:space="preserve"> a real paragraph instead of </w:t>
-      </w:r>
-      <w:r>
-        <w:rPr>
-          <w:b/>
-        </w:rPr>
-        <w:t xml:space="preserve">showing</w:t>
-      </w:r>
-      <w:r>
-        <w:t xml:space="preserve"> the tags. So every </w:t>
+        <w:t xml:space="preserve"> directly, the browser would follow it as an instruction and make a real paragraph, instead of showing the code itself. To stop this, we replaced every </w:t>
       </w:r>
       <w:r>
         <w:rPr>
@@ -4578,7 +5118,7 @@
         <w:t xml:space="preserve">&lt;</w:t>
       </w:r>
       <w:r>
-        <w:t xml:space="preserve"> is replaced with </w:t>
+        <w:t xml:space="preserve"> with </w:t>
       </w:r>
       <w:r>
         <w:rPr>
@@ -4614,7 +5154,7 @@
         <w:t xml:space="preserve">&amp;gt;</w:t>
       </w:r>
       <w:r>
-        <w:t xml:space="preserve">:</w:t>
+        <w:t xml:space="preserve">. The browser then shows the symbols instead of following them:</w:t>
       </w:r>
     </w:p>
     <w:tbl>
@@ -4676,7 +5216,7 @@
               <w:rPr>
                 <w:b/>
               </w:rPr>
-              <w:t xml:space="preserve">What it does</w:t>
+              <w:t xml:space="preserve">What it means</w:t>
             </w:r>
           </w:p>
         </w:tc>
@@ -4714,7 +5254,7 @@
               <w:spacing w:before="0" w:after="0"/>
             </w:pPr>
             <w:r>
-              <w:t xml:space="preserve">Displays as </w:t>
+              <w:t xml:space="preserve">Shows on the page as </w:t>
             </w:r>
             <w:r>
               <w:rPr>
@@ -4726,7 +5266,7 @@
               <w:t xml:space="preserve">&lt;html&gt;</w:t>
             </w:r>
             <w:r>
-              <w:t xml:space="preserve">. This is the root element of the example page.</w:t>
+              <w:t xml:space="preserve">, the tag that wraps the whole example page.</w:t>
             </w:r>
           </w:p>
         </w:tc>
@@ -4764,7 +5304,7 @@
               <w:spacing w:before="0" w:after="0"/>
             </w:pPr>
             <w:r>
-              <w:t xml:space="preserve">Displays as </w:t>
+              <w:t xml:space="preserve">Shows as </w:t>
             </w:r>
             <w:r>
               <w:rPr>
@@ -4776,7 +5316,7 @@
               <w:t xml:space="preserve">&lt;head&gt;…&lt;/head&gt;</w:t>
             </w:r>
             <w:r>
-              <w:t xml:space="preserve">. It holds the page information.</w:t>
+              <w:t xml:space="preserve">, the "behind the scenes" section of the example page.</w:t>
             </w:r>
           </w:p>
         </w:tc>
@@ -4814,7 +5354,7 @@
               <w:spacing w:before="0" w:after="0"/>
             </w:pPr>
             <w:r>
-              <w:t xml:space="preserve">Displays as </w:t>
+              <w:t xml:space="preserve">Shows as </w:t>
             </w:r>
             <w:r>
               <w:rPr>
@@ -4826,7 +5366,7 @@
               <w:t xml:space="preserve">&lt;title&gt;Hello&lt;/title&gt;</w:t>
             </w:r>
             <w:r>
-              <w:t xml:space="preserve">. This would make the browser tab say "Hello".</w:t>
+              <w:t xml:space="preserve">. On a real page, this would put the word "Hello" on the browser tab.</w:t>
             </w:r>
           </w:p>
         </w:tc>
@@ -4864,7 +5404,7 @@
               <w:spacing w:before="0" w:after="0"/>
             </w:pPr>
             <w:r>
-              <w:t xml:space="preserve">Displays as </w:t>
+              <w:t xml:space="preserve">Shows as </w:t>
             </w:r>
             <w:r>
               <w:rPr>
@@ -4876,7 +5416,7 @@
               <w:t xml:space="preserve">&lt;body&gt;…&lt;/body&gt;</w:t>
             </w:r>
             <w:r>
-              <w:t xml:space="preserve">. It holds the visible content.</w:t>
+              <w:t xml:space="preserve">, the visible part of the example page.</w:t>
             </w:r>
           </w:p>
         </w:tc>
@@ -4914,7 +5454,7 @@
               <w:spacing w:before="0" w:after="0"/>
             </w:pPr>
             <w:r>
-              <w:t xml:space="preserve">Displays as </w:t>
+              <w:t xml:space="preserve">Shows as </w:t>
             </w:r>
             <w:r>
               <w:rPr>
@@ -4926,7 +5466,7 @@
               <w:t xml:space="preserve">&lt;p&gt;Hello World!&lt;/p&gt;</w:t>
             </w:r>
             <w:r>
-              <w:t xml:space="preserve">. It's a paragraph containing the text Hello World!</w:t>
+              <w:t xml:space="preserve">. On a real page, this would display a paragraph saying "Hello World!".</w:t>
             </w:r>
           </w:p>
         </w:tc>
@@ -4964,7 +5504,28 @@
               <w:spacing w:before="0" w:after="0"/>
             </w:pPr>
             <w:r>
-              <w:t xml:space="preserve">Closes the flexbox container, then draws a line to end Part 2.</w:t>
+              <w:rPr>
+                <w:rFonts w:ascii="Consolas" w:hAnsi="Consolas" w:cs="Consolas"/>
+                <w:sz w:val="19"/>
+                <w:szCs w:val="19"/>
+                <w:shd w:val="clear" w:color="auto" w:fill="F2F2F2"/>
+              </w:rPr>
+              <w:t xml:space="preserve">&lt;/div&gt;</w:t>
+            </w:r>
+            <w:r>
+              <w:t xml:space="preserve"> closes the box holding the logo and code. </w:t>
+            </w:r>
+            <w:r>
+              <w:rPr>
+                <w:rFonts w:ascii="Consolas" w:hAnsi="Consolas" w:cs="Consolas"/>
+                <w:sz w:val="19"/>
+                <w:szCs w:val="19"/>
+                <w:shd w:val="clear" w:color="auto" w:fill="F2F2F2"/>
+              </w:rPr>
+              <w:t xml:space="preserve">&lt;hr&gt;</w:t>
+            </w:r>
+            <w:r>
+              <w:t xml:space="preserve"> draws a line to finish Part 2.</w:t>
             </w:r>
           </w:p>
         </w:tc>
@@ -4985,7 +5546,7 @@
     </w:p>
     <w:p>
       <w:r>
-        <w:t xml:space="preserve">Part 3 lists four university policies and services. Each one has a heading, an indented paragraph and a link that opens in a new tab. The Student Support Advisers section also has a contact table.</w:t>
+        <w:t xml:space="preserve">Part 3 gives information about four university policies and services. Each one has a heading, a short paragraph that is pushed in slightly from the left, and a link to the UOW website that opens in a new tab. The Student Support Advisers section also has a small table with the advisers' contact details.</w:t>
       </w:r>
     </w:p>
     <w:p>
@@ -5050,7 +5611,7 @@
         <w:pStyle w:val="Heading2"/>
       </w:pPr>
       <w:r>
-        <w:t xml:space="preserve">3.1 Part 3 heading and Plagiarism (lines 105–117)</w:t>
+        <w:t xml:space="preserve">3.1 The Part 3 heading and Plagiarism (lines 105–117)</w:t>
       </w:r>
     </w:p>
     <w:p>
@@ -5169,7 +5730,7 @@
               <w:rPr>
                 <w:b/>
               </w:rPr>
-              <w:t xml:space="preserve">What it does</w:t>
+              <w:t xml:space="preserve">What it means</w:t>
             </w:r>
           </w:p>
         </w:tc>
@@ -5207,7 +5768,7 @@
               <w:spacing w:before="0" w:after="0"/>
             </w:pPr>
             <w:r>
-              <w:t xml:space="preserve">The Part 3 heading. It's written in capitals, but HTML tags aren't case sensitive, so </w:t>
+              <w:t xml:space="preserve">The main heading for Part 3. We wrote it in capital letters, but HTML doesn't care about capitals in tag names, so </w:t>
             </w:r>
             <w:r>
               <w:rPr>
@@ -5219,7 +5780,7 @@
               <w:t xml:space="preserve">&lt;H1&gt;</w:t>
             </w:r>
             <w:r>
-              <w:t xml:space="preserve"> works the same as </w:t>
+              <w:t xml:space="preserve"> works exactly the same as </w:t>
             </w:r>
             <w:r>
               <w:rPr>
@@ -5269,7 +5830,7 @@
               <w:spacing w:before="0" w:after="0"/>
             </w:pPr>
             <w:r>
-              <w:t xml:space="preserve">Our comments explaining the margin settings below.</w:t>
+              <w:t xml:space="preserve">Our notes explaining the spacing settings used below.</w:t>
             </w:r>
           </w:p>
         </w:tc>
@@ -5307,7 +5868,7 @@
               <w:spacing w:before="0" w:after="0"/>
             </w:pPr>
             <w:r>
-              <w:t xml:space="preserve">A smaller heading for the topic.</w:t>
+              <w:t xml:space="preserve">A smaller heading for this topic.</w:t>
             </w:r>
           </w:p>
         </w:tc>
@@ -5345,25 +5906,16 @@
               <w:spacing w:before="0" w:after="0"/>
             </w:pPr>
             <w:r>
-              <w:t xml:space="preserve">A margin is the space </w:t>
+              <w:t xml:space="preserve">Headings normally leave a gap of empty space underneath them. A </w:t>
             </w:r>
             <w:r>
               <w:rPr>
                 <w:b/>
               </w:rPr>
-              <w:t xml:space="preserve">outside</w:t>
-            </w:r>
-            <w:r>
-              <w:t xml:space="preserve"> an element. Headings normally have a gap underneath them. A negative value pulls the paragraph 10px </w:t>
-            </w:r>
-            <w:r>
-              <w:rPr>
-                <w:b/>
-              </w:rPr>
-              <w:t xml:space="preserve">closer</w:t>
-            </w:r>
-            <w:r>
-              <w:t xml:space="preserve"> to the heading, so the two read as one block.</w:t>
+              <w:t xml:space="preserve">minus</w:t>
+            </w:r>
+            <w:r>
+              <w:t xml:space="preserve"> number shrinks that gap: here it pulls the paragraph 10 pixels closer to the heading, so the heading and paragraph look like they belong together.</w:t>
             </w:r>
           </w:p>
         </w:tc>
@@ -5401,7 +5953,7 @@
               <w:spacing w:before="0" w:after="0"/>
             </w:pPr>
             <w:r>
-              <w:t xml:space="preserve">Paragraph. It holds the main text.</w:t>
+              <w:t xml:space="preserve">Starts a paragraph, which holds the main text.</w:t>
             </w:r>
           </w:p>
         </w:tc>
@@ -5439,7 +5991,7 @@
               <w:spacing w:before="0" w:after="0"/>
             </w:pPr>
             <w:r>
-              <w:t xml:space="preserve">Indents the paragraph 30px to the right, so it sits under the heading like sub-content.</w:t>
+              <w:t xml:space="preserve">Pushes the paragraph 30 pixels in from the left, like an indent. It sits slightly to the right of its heading, which makes it clear the text belongs under that heading.</w:t>
             </w:r>
           </w:p>
         </w:tc>
@@ -5477,45 +6029,45 @@
               <w:spacing w:before="0" w:after="0"/>
             </w:pPr>
             <w:r>
-              <w:t xml:space="preserve">Removes the normal gap below the paragraph.</w:t>
-            </w:r>
-          </w:p>
-        </w:tc>
-      </w:tr>
-      <w:tr>
-        <w:trPr>
-          <w:cantSplit/>
-        </w:trPr>
-        <w:tc>
-          <w:tcPr>
-            <w:tcW w:w="3100" w:type="dxa"/>
-            <w:shd w:val="clear" w:color="auto" w:fill="F7F9FC"/>
-          </w:tcPr>
-          <w:p>
-            <w:pPr>
-              <w:spacing w:before="0" w:after="0"/>
-            </w:pPr>
-            <w:r>
-              <w:rPr>
-                <w:rFonts w:ascii="Consolas" w:hAnsi="Consolas" w:cs="Consolas"/>
-                <w:sz w:val="18"/>
-                <w:szCs w:val="18"/>
-                <w:shd w:val="clear" w:color="auto" w:fill="F2F2F2"/>
-              </w:rPr>
-              <w:t xml:space="preserve">Line breaks in the text (111–112)</w:t>
-            </w:r>
-          </w:p>
-        </w:tc>
-        <w:tc>
-          <w:tcPr>
-            <w:tcW w:w="5926" w:type="dxa"/>
-          </w:tcPr>
-          <w:p>
-            <w:pPr>
-              <w:spacing w:before="0" w:after="0"/>
-            </w:pPr>
-            <w:r>
-              <w:t xml:space="preserve">The browser ignores line breaks in our HTML file. It joins the text together and wraps it to fit the window. Splitting the text only keeps our code easier to read.</w:t>
+              <w:t xml:space="preserve">Removes the gap the browser would normally leave below a paragraph.</w:t>
+            </w:r>
+          </w:p>
+        </w:tc>
+      </w:tr>
+      <w:tr>
+        <w:trPr>
+          <w:cantSplit/>
+        </w:trPr>
+        <w:tc>
+          <w:tcPr>
+            <w:tcW w:w="3100" w:type="dxa"/>
+            <w:shd w:val="clear" w:color="auto" w:fill="F7F9FC"/>
+          </w:tcPr>
+          <w:p>
+            <w:pPr>
+              <w:spacing w:before="0" w:after="0"/>
+            </w:pPr>
+            <w:r>
+              <w:rPr>
+                <w:rFonts w:ascii="Consolas" w:hAnsi="Consolas" w:cs="Consolas"/>
+                <w:sz w:val="18"/>
+                <w:szCs w:val="18"/>
+                <w:shd w:val="clear" w:color="auto" w:fill="F2F2F2"/>
+              </w:rPr>
+              <w:t xml:space="preserve">Text split over lines 111–112</w:t>
+            </w:r>
+          </w:p>
+        </w:tc>
+        <w:tc>
+          <w:tcPr>
+            <w:tcW w:w="5926" w:type="dxa"/>
+          </w:tcPr>
+          <w:p>
+            <w:pPr>
+              <w:spacing w:before="0" w:after="0"/>
+            </w:pPr>
+            <w:r>
+              <w:t xml:space="preserve">In our code, the paragraph is split over two lines just to keep it easy to read. The browser ignores where we pressed Enter: it joins the text back together and fits it to the width of the window.</w:t>
             </w:r>
           </w:p>
         </w:tc>
@@ -5553,7 +6105,7 @@
               <w:spacing w:before="0" w:after="0"/>
             </w:pPr>
             <w:r>
-              <w:t xml:space="preserve">Forces a new line, so "Please click here…" starts on its own line.</w:t>
+              <w:t xml:space="preserve">A line break (like pressing Enter). It makes "Please click here…" start on a new line.</w:t>
             </w:r>
           </w:p>
         </w:tc>
@@ -5591,7 +6143,7 @@
               <w:spacing w:before="0" w:after="0"/>
             </w:pPr>
             <w:r>
-              <w:t xml:space="preserve">A link. </w:t>
+              <w:t xml:space="preserve">A link to the UOW plagiarism page. The web address goes inside </w:t>
             </w:r>
             <w:r>
               <w:rPr>
@@ -5603,7 +6155,7 @@
               <w:t xml:space="preserve">href</w:t>
             </w:r>
             <w:r>
-              <w:t xml:space="preserve"> holds the web address of the UOW page. The word "here" is the clickable text (shown blue and underlined).</w:t>
+              <w:t xml:space="preserve">, and the word "here" is what the user sees and clicks (shown blue and underlined).</w:t>
             </w:r>
           </w:p>
         </w:tc>
@@ -5650,7 +6202,7 @@
               <w:t xml:space="preserve">new browser tab</w:t>
             </w:r>
             <w:r>
-              <w:t xml:space="preserve">, so the user doesn't leave our page.</w:t>
+              <w:t xml:space="preserve"> instead of replacing our page. That way, the user can read the UOW page and still have our page open.</w:t>
             </w:r>
           </w:p>
         </w:tc>
@@ -5766,7 +6318,7 @@
     </w:p>
     <w:p>
       <w:r>
-        <w:t xml:space="preserve">This uses exactly the same pattern as Plagiarism: an </w:t>
+        <w:t xml:space="preserve">This section uses exactly the same pattern as Plagiarism: an </w:t>
       </w:r>
       <w:r>
         <w:rPr>
@@ -5778,7 +6330,7 @@
         <w:t xml:space="preserve">&lt;h3&gt;</w:t>
       </w:r>
       <w:r>
-        <w:t xml:space="preserve"> with </w:t>
+        <w:t xml:space="preserve"> heading pulled close to its paragraph with </w:t>
       </w:r>
       <w:r>
         <w:rPr>
@@ -5790,19 +6342,7 @@
         <w:t xml:space="preserve">margin-bottom: -10px</w:t>
       </w:r>
       <w:r>
-        <w:t xml:space="preserve">, an indented </w:t>
-      </w:r>
-      <w:r>
-        <w:rPr>
-          <w:rFonts w:ascii="Consolas" w:hAnsi="Consolas" w:cs="Consolas"/>
-          <w:sz w:val="19"/>
-          <w:szCs w:val="19"/>
-          <w:shd w:val="clear" w:color="auto" w:fill="F2F2F2"/>
-        </w:rPr>
-        <w:t xml:space="preserve">&lt;p&gt;</w:t>
-      </w:r>
-      <w:r>
-        <w:t xml:space="preserve">, a </w:t>
+        <w:t xml:space="preserve">, a paragraph indented by 30 pixels, a </w:t>
       </w:r>
       <w:r>
         <w:rPr>
@@ -5814,7 +6354,7 @@
         <w:t xml:space="preserve">&lt;br&gt;</w:t>
       </w:r>
       <w:r>
-        <w:t xml:space="preserve"> and then a link with </w:t>
+        <w:t xml:space="preserve"> to start a new line, and a link that opens in a new tab with </w:t>
       </w:r>
       <w:r>
         <w:rPr>
@@ -5826,7 +6366,7 @@
         <w:t xml:space="preserve">target="_blank"</w:t>
       </w:r>
       <w:r>
-        <w:t xml:space="preserve">.</w:t>
+        <w:t xml:space="preserve">. A couple of small things to point out:</w:t>
       </w:r>
     </w:p>
     <w:p>
@@ -5837,7 +6377,7 @@
         </w:numPr>
       </w:pPr>
       <w:r>
-        <w:t xml:space="preserve">There are two spaces after "Please click" in our code. The browser shrinks multiple spaces down to one, so the page still looks normal.</w:t>
+        <w:t xml:space="preserve">There are two spaces after "Please click" in our code. This doesn't show on the page, because the browser turns several spaces in a row into just one.</w:t>
       </w:r>
     </w:p>
     <w:p>
@@ -5860,7 +6400,7 @@
         <w:t xml:space="preserve">&lt;br&gt;</w:t>
       </w:r>
       <w:r>
-        <w:t xml:space="preserve"> on line 128 is indented differently from the others. Indentation in HTML only affects how the code looks, not how the page looks.</w:t>
+        <w:t xml:space="preserve"> on line 128 is indented further than the others. This doesn't change anything on the page either. Indenting in HTML only makes the code tidier (or messier) to read.</w:t>
       </w:r>
     </w:p>
     <w:p>
@@ -5930,7 +6470,7 @@
     </w:p>
     <w:p>
       <w:r>
-        <w:t xml:space="preserve">Same heading/paragraph/link pattern again, with one addition:</w:t>
+        <w:t xml:space="preserve">This is the same heading, paragraph and link pattern again, with one new thing:</w:t>
       </w:r>
     </w:p>
     <w:tbl>
@@ -5992,7 +6532,7 @@
               <w:rPr>
                 <w:b/>
               </w:rPr>
-              <w:t xml:space="preserve">What it does</w:t>
+              <w:t xml:space="preserve">What it means</w:t>
             </w:r>
           </w:p>
         </w:tc>
@@ -6030,45 +6570,45 @@
               <w:spacing w:before="0" w:after="0"/>
             </w:pPr>
             <w:r>
-              <w:t xml:space="preserve">Two line breaks in a row. The first ends the current line, and the second adds a blank line. This leaves a gap before the "contact details" sentence.</w:t>
-            </w:r>
-          </w:p>
-        </w:tc>
-      </w:tr>
-      <w:tr>
-        <w:trPr>
-          <w:cantSplit/>
-        </w:trPr>
-        <w:tc>
-          <w:tcPr>
-            <w:tcW w:w="3100" w:type="dxa"/>
-            <w:shd w:val="clear" w:color="auto" w:fill="F7F9FC"/>
-          </w:tcPr>
-          <w:p>
-            <w:pPr>
-              <w:spacing w:before="0" w:after="0"/>
-            </w:pPr>
-            <w:r>
-              <w:rPr>
-                <w:rFonts w:ascii="Consolas" w:hAnsi="Consolas" w:cs="Consolas"/>
-                <w:sz w:val="18"/>
-                <w:szCs w:val="18"/>
-                <w:shd w:val="clear" w:color="auto" w:fill="F2F2F2"/>
-              </w:rPr>
-              <w:t xml:space="preserve">Contact details sentence</w:t>
-            </w:r>
-          </w:p>
-        </w:tc>
-        <w:tc>
-          <w:tcPr>
-            <w:tcW w:w="5926" w:type="dxa"/>
-          </w:tcPr>
-          <w:p>
-            <w:pPr>
-              <w:spacing w:before="0" w:after="0"/>
-            </w:pPr>
-            <w:r>
-              <w:t xml:space="preserve">This last line introduces the contact table that comes straight after the paragraph.</w:t>
+              <w:t xml:space="preserve">Two line breaks in a row, like pressing Enter twice. The first one moves to a new line and the second one leaves a blank line. This creates a gap before the next sentence.</w:t>
+            </w:r>
+          </w:p>
+        </w:tc>
+      </w:tr>
+      <w:tr>
+        <w:trPr>
+          <w:cantSplit/>
+        </w:trPr>
+        <w:tc>
+          <w:tcPr>
+            <w:tcW w:w="3100" w:type="dxa"/>
+            <w:shd w:val="clear" w:color="auto" w:fill="F7F9FC"/>
+          </w:tcPr>
+          <w:p>
+            <w:pPr>
+              <w:spacing w:before="0" w:after="0"/>
+            </w:pPr>
+            <w:r>
+              <w:rPr>
+                <w:rFonts w:ascii="Consolas" w:hAnsi="Consolas" w:cs="Consolas"/>
+                <w:sz w:val="18"/>
+                <w:szCs w:val="18"/>
+                <w:shd w:val="clear" w:color="auto" w:fill="F2F2F2"/>
+              </w:rPr>
+              <w:t xml:space="preserve">"Student Support Adviser contact details…"</w:t>
+            </w:r>
+          </w:p>
+        </w:tc>
+        <w:tc>
+          <w:tcPr>
+            <w:tcW w:w="5926" w:type="dxa"/>
+          </w:tcPr>
+          <w:p>
+            <w:pPr>
+              <w:spacing w:before="0" w:after="0"/>
+            </w:pPr>
+            <w:r>
+              <w:t xml:space="preserve">This last sentence introduces the contact table, which comes straight after the paragraph.</w:t>
             </w:r>
           </w:p>
         </w:tc>
@@ -6084,7 +6624,7 @@
         <w:pStyle w:val="Heading2"/>
       </w:pPr>
       <w:r>
-        <w:t xml:space="preserve">3.4 Contact table (lines 140–165)</w:t>
+        <w:t xml:space="preserve">3.4 The contact table (lines 140–165)</w:t>
       </w:r>
     </w:p>
     <w:p>
@@ -6203,7 +6743,7 @@
               <w:rPr>
                 <w:b/>
               </w:rPr>
-              <w:t xml:space="preserve">What it does</w:t>
+              <w:t xml:space="preserve">What it means</w:t>
             </w:r>
           </w:p>
         </w:tc>
@@ -6241,7 +6781,7 @@
               <w:spacing w:before="0" w:after="0"/>
             </w:pPr>
             <w:r>
-              <w:t xml:space="preserve">A multi-line comment with our notes on the table settings.</w:t>
+              <w:t xml:space="preserve">A comment that spans several lines, with our notes on what each table setting does.</w:t>
             </w:r>
           </w:p>
         </w:tc>
@@ -6279,7 +6819,7 @@
               <w:spacing w:before="0" w:after="0"/>
             </w:pPr>
             <w:r>
-              <w:t xml:space="preserve">Draws a 1-pixel border around the table and every cell.</w:t>
+              <w:t xml:space="preserve">Draws 1-pixel lines around the table and each box, the same as in Part 1.</w:t>
             </w:r>
           </w:p>
         </w:tc>
@@ -6317,7 +6857,7 @@
               <w:spacing w:before="0" w:after="0"/>
             </w:pPr>
             <w:r>
-              <w:t xml:space="preserve">Moves the table 30px to the right so it lines up with the indented paragraphs above.</w:t>
+              <w:t xml:space="preserve">Pushes the table 30 pixels in from the left, so it lines up with the indented paragraphs above it.</w:t>
             </w:r>
           </w:p>
         </w:tc>
@@ -6355,7 +6895,7 @@
               <w:spacing w:before="0" w:after="0"/>
             </w:pPr>
             <w:r>
-              <w:t xml:space="preserve">Adds a small 5px gap between the paragraph above and the top of the table.</w:t>
+              <w:t xml:space="preserve">Adds a small 5-pixel gap above the table, so it doesn't touch the sentence above.</w:t>
             </w:r>
           </w:p>
         </w:tc>
@@ -6393,45 +6933,45 @@
               <w:spacing w:before="0" w:after="0"/>
             </w:pPr>
             <w:r>
-              <w:t xml:space="preserve">Adds 5px of space inside each cell so the text doesn't touch the borders.</w:t>
-            </w:r>
-          </w:p>
-        </w:tc>
-      </w:tr>
-      <w:tr>
-        <w:trPr>
-          <w:cantSplit/>
-        </w:trPr>
-        <w:tc>
-          <w:tcPr>
-            <w:tcW w:w="3100" w:type="dxa"/>
-            <w:shd w:val="clear" w:color="auto" w:fill="F7F9FC"/>
-          </w:tcPr>
-          <w:p>
-            <w:pPr>
-              <w:spacing w:before="0" w:after="0"/>
-            </w:pPr>
-            <w:r>
-              <w:rPr>
-                <w:rFonts w:ascii="Consolas" w:hAnsi="Consolas" w:cs="Consolas"/>
-                <w:sz w:val="18"/>
-                <w:szCs w:val="18"/>
-                <w:shd w:val="clear" w:color="auto" w:fill="F2F2F2"/>
-              </w:rPr>
-              <w:t xml:space="preserve">One &lt;tr&gt;, two &lt;td&gt;</w:t>
-            </w:r>
-          </w:p>
-        </w:tc>
-        <w:tc>
-          <w:tcPr>
-            <w:tcW w:w="5926" w:type="dxa"/>
-          </w:tcPr>
-          <w:p>
-            <w:pPr>
-              <w:spacing w:before="0" w:after="0"/>
-            </w:pPr>
-            <w:r>
-              <w:t xml:space="preserve">The table has one row with two cells, so the two advisers appear side by side.</w:t>
+              <w:t xml:space="preserve">Adds 5 pixels of space inside each box, so the text doesn't touch the lines.</w:t>
+            </w:r>
+          </w:p>
+        </w:tc>
+      </w:tr>
+      <w:tr>
+        <w:trPr>
+          <w:cantSplit/>
+        </w:trPr>
+        <w:tc>
+          <w:tcPr>
+            <w:tcW w:w="3100" w:type="dxa"/>
+            <w:shd w:val="clear" w:color="auto" w:fill="F7F9FC"/>
+          </w:tcPr>
+          <w:p>
+            <w:pPr>
+              <w:spacing w:before="0" w:after="0"/>
+            </w:pPr>
+            <w:r>
+              <w:rPr>
+                <w:rFonts w:ascii="Consolas" w:hAnsi="Consolas" w:cs="Consolas"/>
+                <w:sz w:val="18"/>
+                <w:szCs w:val="18"/>
+                <w:shd w:val="clear" w:color="auto" w:fill="F2F2F2"/>
+              </w:rPr>
+              <w:t xml:space="preserve">One &lt;tr&gt; with two &lt;td&gt;</w:t>
+            </w:r>
+          </w:p>
+        </w:tc>
+        <w:tc>
+          <w:tcPr>
+            <w:tcW w:w="5926" w:type="dxa"/>
+          </w:tcPr>
+          <w:p>
+            <w:pPr>
+              <w:spacing w:before="0" w:after="0"/>
+            </w:pPr>
+            <w:r>
+              <w:t xml:space="preserve">The table has only one row with two boxes in it. This puts the two advisers next to each other, like two business cards side by side.</w:t>
             </w:r>
           </w:p>
         </w:tc>
@@ -6469,7 +7009,16 @@
               <w:spacing w:before="0" w:after="0"/>
             </w:pPr>
             <w:r>
-              <w:t xml:space="preserve">Starts the text at the top of each cell. Without it, a cell with fewer lines would float in the middle and the two cards wouldn't line up.</w:t>
+              <w:t xml:space="preserve">"Vertical align: top" makes the text start at the </w:t>
+            </w:r>
+            <w:r>
+              <w:rPr>
+                <w:b/>
+              </w:rPr>
+              <w:t xml:space="preserve">top</w:t>
+            </w:r>
+            <w:r>
+              <w:t xml:space="preserve"> of each box. Without it, if one box had less text, that text would sit in the middle of the box and the two cards wouldn't line up.</w:t>
             </w:r>
           </w:p>
         </w:tc>
@@ -6507,45 +7056,45 @@
               <w:spacing w:before="0" w:after="0"/>
             </w:pPr>
             <w:r>
-              <w:t xml:space="preserve">Makes the adviser's name bold to show it's important.</w:t>
-            </w:r>
-          </w:p>
-        </w:tc>
-      </w:tr>
-      <w:tr>
-        <w:trPr>
-          <w:cantSplit/>
-        </w:trPr>
-        <w:tc>
-          <w:tcPr>
-            <w:tcW w:w="3100" w:type="dxa"/>
-            <w:shd w:val="clear" w:color="auto" w:fill="F7F9FC"/>
-          </w:tcPr>
-          <w:p>
-            <w:pPr>
-              <w:spacing w:before="0" w:after="0"/>
-            </w:pPr>
-            <w:r>
-              <w:rPr>
-                <w:rFonts w:ascii="Consolas" w:hAnsi="Consolas" w:cs="Consolas"/>
-                <w:sz w:val="18"/>
-                <w:szCs w:val="18"/>
-                <w:shd w:val="clear" w:color="auto" w:fill="F2F2F2"/>
-              </w:rPr>
-              <w:t xml:space="preserve">&lt;br&gt; after each detail</w:t>
-            </w:r>
-          </w:p>
-        </w:tc>
-        <w:tc>
-          <w:tcPr>
-            <w:tcW w:w="5926" w:type="dxa"/>
-          </w:tcPr>
-          <w:p>
-            <w:pPr>
-              <w:spacing w:before="0" w:after="0"/>
-            </w:pPr>
-            <w:r>
-              <w:t xml:space="preserve">Puts the building, campus, phone number and days on separate lines, like a contact card.</w:t>
+              <w:t xml:space="preserve">Makes the text bold. We used it for each adviser's name so it stands out as the most important line.</w:t>
+            </w:r>
+          </w:p>
+        </w:tc>
+      </w:tr>
+      <w:tr>
+        <w:trPr>
+          <w:cantSplit/>
+        </w:trPr>
+        <w:tc>
+          <w:tcPr>
+            <w:tcW w:w="3100" w:type="dxa"/>
+            <w:shd w:val="clear" w:color="auto" w:fill="F7F9FC"/>
+          </w:tcPr>
+          <w:p>
+            <w:pPr>
+              <w:spacing w:before="0" w:after="0"/>
+            </w:pPr>
+            <w:r>
+              <w:rPr>
+                <w:rFonts w:ascii="Consolas" w:hAnsi="Consolas" w:cs="Consolas"/>
+                <w:sz w:val="18"/>
+                <w:szCs w:val="18"/>
+                <w:shd w:val="clear" w:color="auto" w:fill="F2F2F2"/>
+              </w:rPr>
+              <w:t xml:space="preserve">&lt;br&gt; after each line</w:t>
+            </w:r>
+          </w:p>
+        </w:tc>
+        <w:tc>
+          <w:tcPr>
+            <w:tcW w:w="5926" w:type="dxa"/>
+          </w:tcPr>
+          <w:p>
+            <w:pPr>
+              <w:spacing w:before="0" w:after="0"/>
+            </w:pPr>
+            <w:r>
+              <w:t xml:space="preserve">Puts the building, campus, phone number and working days on separate lines, like an address on an envelope.</w:t>
             </w:r>
           </w:p>
         </w:tc>
@@ -6583,19 +7132,7 @@
               <w:spacing w:before="0" w:after="0"/>
             </w:pPr>
             <w:r>
-              <w:t xml:space="preserve">A </w:t>
-            </w:r>
-            <w:r>
-              <w:rPr>
-                <w:rFonts w:ascii="Consolas" w:hAnsi="Consolas" w:cs="Consolas"/>
-                <w:sz w:val="19"/>
-                <w:szCs w:val="19"/>
-                <w:shd w:val="clear" w:color="auto" w:fill="F2F2F2"/>
-              </w:rPr>
-              <w:t xml:space="preserve">mailto:</w:t>
-            </w:r>
-            <w:r>
-              <w:t xml:space="preserve"> link. Clicking the email address opens the user's email app with a new email already addressed to that adviser.</w:t>
+              <w:t xml:space="preserve">A special kind of link for email addresses. Clicking it opens the user's email app with a new email already addressed to that adviser, so they don't have to copy the address.</w:t>
             </w:r>
           </w:p>
         </w:tc>
@@ -6673,7 +7210,7 @@
     </w:p>
     <w:p>
       <w:r>
-        <w:t xml:space="preserve">The last section follows the same pattern as the others: an </w:t>
+        <w:t xml:space="preserve">The last section follows the same pattern as the other three: an </w:t>
       </w:r>
       <w:r>
         <w:rPr>
@@ -6685,7 +7222,7 @@
         <w:t xml:space="preserve">&lt;h3&gt;</w:t>
       </w:r>
       <w:r>
-        <w:t xml:space="preserve"> heading pulled close with </w:t>
+        <w:t xml:space="preserve"> heading with </w:t>
       </w:r>
       <w:r>
         <w:rPr>
@@ -6697,7 +7234,7 @@
         <w:t xml:space="preserve">margin-bottom: -10px</w:t>
       </w:r>
       <w:r>
-        <w:t xml:space="preserve">, an indented paragraph, a </w:t>
+        <w:t xml:space="preserve"> to keep it close to its text, a paragraph indented by 30 pixels, a </w:t>
       </w:r>
       <w:r>
         <w:rPr>
@@ -6709,7 +7246,7 @@
         <w:t xml:space="preserve">&lt;br&gt;</w:t>
       </w:r>
       <w:r>
-        <w:t xml:space="preserve">, and a link that opens in a new tab with </w:t>
+        <w:t xml:space="preserve"> to start a new line, and a link that opens in a new tab with </w:t>
       </w:r>
       <w:r>
         <w:rPr>
@@ -6733,7 +7270,26 @@
         <w:t xml:space="preserve">&lt;hr&gt;</w:t>
       </w:r>
       <w:r>
-        <w:t xml:space="preserve"> at the end draws a line to finish Part 3.</w:t>
+        <w:t xml:space="preserve"> at the very end draws a line to finish Part 3.</w:t>
+      </w:r>
+    </w:p>
+    <w:p>
+      <w:pPr>
+        <w:pBdr>
+          <w:left w:val="single" w:sz="24" w:space="8" w:color="4F81BD"/>
+        </w:pBdr>
+        <w:shd w:val="clear" w:color="auto" w:fill="EAF1FB"/>
+        <w:spacing w:before="80" w:after="120"/>
+        <w:ind w:left="200" w:right="100"/>
+      </w:pPr>
+      <w:r>
+        <w:rPr>
+          <w:b/>
+        </w:rPr>
+        <w:t xml:space="preserve">Why we repeated the same pattern for every section:</w:t>
+      </w:r>
+      <w:r>
+        <w:t xml:space="preserve"> using the same heading, spacing and link style for all four sections makes the page look neat and consistent, and makes it easy for the reader to find information. It also made our code easier to write, because once one section worked, we could copy its structure for the others.</w:t>
       </w:r>
     </w:p>
     <w:sectPr>

</xml_diff>